<commit_message>
Update lab 2 document
Co-Authored-By: Claude Sonnet 5 <noreply@anthropic.com>
</commit_message>
<xml_diff>
--- a/lab 2.docx
+++ b/lab 2.docx
@@ -2,16 +2,2156 @@
 <file path=word/document.xml><?xml version="1.0" encoding="utf-8"?>
 <w:document xmlns:wpc="http://schemas.microsoft.com/office/word/2010/wordprocessingCanvas" xmlns:cx="http://schemas.microsoft.com/office/drawing/2014/chartex" xmlns:cx1="http://schemas.microsoft.com/office/drawing/2015/9/8/chartex" xmlns:cx2="http://schemas.microsoft.com/office/drawing/2015/10/21/chartex" xmlns:cx3="http://schemas.microsoft.com/office/drawing/2016/5/9/chartex" xmlns:cx4="http://schemas.microsoft.com/office/drawing/2016/5/10/chartex" xmlns:cx5="http://schemas.microsoft.com/office/drawing/2016/5/11/chartex" xmlns:cx6="http://schemas.microsoft.com/office/drawing/2016/5/12/chartex" xmlns:cx7="http://schemas.microsoft.com/office/drawing/2016/5/13/chartex" xmlns:cx8="http://schemas.microsoft.com/office/drawing/2016/5/14/chartex" xmlns:mc="http://schemas.openxmlformats.org/markup-compatibility/2006" xmlns:aink="http://schemas.microsoft.com/office/drawing/2016/ink" xmlns:am3d="http://schemas.microsoft.com/office/drawing/2017/model3d" xmlns:o="urn:schemas-microsoft-com:office:office" xmlns:oel="http://schemas.microsoft.com/office/2019/extlst" xmlns:r="http://schemas.openxmlformats.org/officeDocument/2006/relationships" xmlns:m="http://schemas.openxmlformats.org/officeDocument/2006/math" xmlns:v="urn:schemas-microsoft-com:vml" xmlns:wp14="http://schemas.microsoft.com/office/word/2010/wordprocessingDrawing" xmlns:wp="http://schemas.openxmlformats.org/drawingml/2006/wordprocessingDrawing" xmlns:w10="urn:schemas-microsoft-com:office:word" xmlns:w="http://schemas.openxmlformats.org/wordprocessingml/2006/main" xmlns:w14="http://schemas.microsoft.com/office/word/2010/wordml" xmlns:w15="http://schemas.microsoft.com/office/word/2012/wordml" xmlns:w16cex="http://schemas.microsoft.com/office/word/2018/wordml/cex" xmlns:w16cid="http://schemas.microsoft.com/office/word/2016/wordml/cid" xmlns:w16="http://schemas.microsoft.com/office/word/2018/wordml" xmlns:w16du="http://schemas.microsoft.com/office/word/2023/wordml/word16du" xmlns:w16sdtdh="http://schemas.microsoft.com/office/word/2020/wordml/sdtdatahash" xmlns:w16sdtfl="http://schemas.microsoft.com/office/word/2024/wordml/sdtformatlock" xmlns:w16se="http://schemas.microsoft.com/office/word/2015/wordml/symex" xmlns:wpg="http://schemas.microsoft.com/office/word/2010/wordprocessingGroup" xmlns:wpi="http://schemas.microsoft.com/office/word/2010/wordprocessingInk" xmlns:wne="http://schemas.microsoft.com/office/word/2006/wordml" xmlns:wps="http://schemas.microsoft.com/office/word/2010/wordprocessingShape" mc:Ignorable="w14 w15 w16se w16cid w16 w16cex w16sdtdh w16sdtfl w16du wp14">
   <w:body>
-    <w:p>
-      <w:r>
-        <w:t>Installing cordova</w:t>
-      </w:r>
+    <w:sdt>
+      <w:sdtPr>
+        <w:id w:val="528765823"/>
+        <w:docPartObj>
+          <w:docPartGallery w:val="Cover Pages"/>
+          <w:docPartUnique/>
+        </w:docPartObj>
+      </w:sdtPr>
+      <w:sdtContent>
+        <w:p>
+          <w:r>
+            <w:rPr>
+              <w:noProof/>
+            </w:rPr>
+            <mc:AlternateContent>
+              <mc:Choice Requires="wps">
+                <w:drawing>
+                  <wp:anchor distT="0" distB="0" distL="114300" distR="114300" simplePos="0" relativeHeight="251660288" behindDoc="0" locked="0" layoutInCell="1" allowOverlap="1" wp14:anchorId="4620340B" wp14:editId="15DE4AB3">
+                    <wp:simplePos x="0" y="0"/>
+                    <wp:positionH relativeFrom="page">
+                      <wp:align>center</wp:align>
+                    </wp:positionH>
+                    <mc:AlternateContent>
+                      <mc:Choice Requires="wp14">
+                        <wp:positionV relativeFrom="page">
+                          <wp14:pctPosVOffset>81800</wp14:pctPosVOffset>
+                        </wp:positionV>
+                      </mc:Choice>
+                      <mc:Fallback>
+                        <wp:positionV relativeFrom="page">
+                          <wp:posOffset>8227695</wp:posOffset>
+                        </wp:positionV>
+                      </mc:Fallback>
+                    </mc:AlternateContent>
+                    <wp:extent cx="7315200" cy="914400"/>
+                    <wp:effectExtent l="0" t="0" r="0" b="8255"/>
+                    <wp:wrapSquare wrapText="bothSides"/>
+                    <wp:docPr id="152" name="Text Box 159"/>
+                    <wp:cNvGraphicFramePr/>
+                    <a:graphic xmlns:a="http://schemas.openxmlformats.org/drawingml/2006/main">
+                      <a:graphicData uri="http://schemas.microsoft.com/office/word/2010/wordprocessingShape">
+                        <wps:wsp>
+                          <wps:cNvSpPr txBox="1"/>
+                          <wps:spPr>
+                            <a:xfrm>
+                              <a:off x="0" y="0"/>
+                              <a:ext cx="7315200" cy="914400"/>
+                            </a:xfrm>
+                            <a:prstGeom prst="rect">
+                              <a:avLst/>
+                            </a:prstGeom>
+                            <a:noFill/>
+                            <a:ln w="6350">
+                              <a:noFill/>
+                            </a:ln>
+                            <a:effectLst/>
+                          </wps:spPr>
+                          <wps:style>
+                            <a:lnRef idx="0">
+                              <a:schemeClr val="accent1"/>
+                            </a:lnRef>
+                            <a:fillRef idx="0">
+                              <a:schemeClr val="accent1"/>
+                            </a:fillRef>
+                            <a:effectRef idx="0">
+                              <a:schemeClr val="accent1"/>
+                            </a:effectRef>
+                            <a:fontRef idx="minor">
+                              <a:schemeClr val="dk1"/>
+                            </a:fontRef>
+                          </wps:style>
+                          <wps:txbx>
+                            <w:txbxContent>
+                              <w:sdt>
+                                <w:sdtPr>
+                                  <w:rPr>
+                                    <w:color w:val="595959" w:themeColor="text1" w:themeTint="A6"/>
+                                    <w:sz w:val="28"/>
+                                    <w:szCs w:val="28"/>
+                                  </w:rPr>
+                                  <w:alias w:val="Author"/>
+                                  <w:tag w:val=""/>
+                                  <w:id w:val="789243997"/>
+                                  <w:dataBinding w:prefixMappings="xmlns:ns0='http://purl.org/dc/elements/1.1/' xmlns:ns1='http://schemas.openxmlformats.org/package/2006/metadata/core-properties' " w:xpath="/ns1:coreProperties[1]/ns0:creator[1]" w:storeItemID="{6C3C8BC8-F283-45AE-878A-BAB7291924A1}"/>
+                                  <w:text/>
+                                </w:sdtPr>
+                                <w:sdtContent>
+                                  <w:p>
+                                    <w:pPr>
+                                      <w:pStyle w:val="NoSpacing"/>
+                                      <w:jc w:val="right"/>
+                                      <w:rPr>
+                                        <w:color w:val="595959" w:themeColor="text1" w:themeTint="A6"/>
+                                        <w:sz w:val="28"/>
+                                        <w:szCs w:val="28"/>
+                                      </w:rPr>
+                                    </w:pPr>
+                                    <w:r>
+                                      <w:rPr>
+                                        <w:color w:val="595959" w:themeColor="text1" w:themeTint="A6"/>
+                                        <w:sz w:val="28"/>
+                                        <w:szCs w:val="28"/>
+                                      </w:rPr>
+                                      <w:t>Sameera Lakshan</w:t>
+                                    </w:r>
+                                  </w:p>
+                                </w:sdtContent>
+                              </w:sdt>
+                              <w:p>
+                                <w:pPr>
+                                  <w:pStyle w:val="NoSpacing"/>
+                                  <w:jc w:val="right"/>
+                                  <w:rPr>
+                                    <w:color w:val="595959" w:themeColor="text1" w:themeTint="A6"/>
+                                    <w:sz w:val="18"/>
+                                    <w:szCs w:val="18"/>
+                                  </w:rPr>
+                                </w:pPr>
+                                <w:sdt>
+                                  <w:sdtPr>
+                                    <w:rPr>
+                                      <w:rStyle w:val="Hyperlink"/>
+                                      <w:kern w:val="2"/>
+                                      <w:sz w:val="24"/>
+                                      <w:szCs w:val="24"/>
+                                      <w14:ligatures w14:val="standardContextual"/>
+                                    </w:rPr>
+                                    <w:alias w:val="Email"/>
+                                    <w:tag w:val="Email"/>
+                                    <w:id w:val="942260680"/>
+                                    <w:dataBinding w:prefixMappings="xmlns:ns0='http://schemas.microsoft.com/office/2006/coverPageProps' " w:xpath="/ns0:CoverPageProperties[1]/ns0:CompanyEmail[1]" w:storeItemID="{55AF091B-3C7A-41E3-B477-F2FDAA23CFDA}"/>
+                                    <w:text/>
+                                  </w:sdtPr>
+                                  <w:sdtContent>
+                                    <w:hyperlink r:id="rId6" w:history="1">
+                                      <w:r>
+                                        <w:rPr>
+                                          <w:rStyle w:val="Hyperlink"/>
+                                          <w:kern w:val="2"/>
+                                          <w:sz w:val="24"/>
+                                          <w:szCs w:val="24"/>
+                                          <w:lang w:eastAsia="zh-CN"/>
+                                          <w14:ligatures w14:val="standardContextual"/>
+                                        </w:rPr>
+                                        <w:t>ms26933474@my.sliit.lk</w:t>
+                                      </w:r>
+                                    </w:hyperlink>
+                                  </w:sdtContent>
+                                </w:sdt>
+                              </w:p>
+                            </w:txbxContent>
+                          </wps:txbx>
+                          <wps:bodyPr rot="0" spcFirstLastPara="0" vertOverflow="overflow" horzOverflow="overflow" vert="horz" wrap="square" lIns="1600200" tIns="0" rIns="685800" bIns="0" numCol="1" spcCol="0" rtlCol="0" fromWordArt="0" anchor="b" anchorCtr="0" forceAA="0" compatLnSpc="1">
+                            <a:prstTxWarp prst="textNoShape">
+                              <a:avLst/>
+                            </a:prstTxWarp>
+                            <a:noAutofit/>
+                          </wps:bodyPr>
+                        </wps:wsp>
+                      </a:graphicData>
+                    </a:graphic>
+                    <wp14:sizeRelH relativeFrom="page">
+                      <wp14:pctWidth>94100</wp14:pctWidth>
+                    </wp14:sizeRelH>
+                    <wp14:sizeRelV relativeFrom="page">
+                      <wp14:pctHeight>9200</wp14:pctHeight>
+                    </wp14:sizeRelV>
+                  </wp:anchor>
+                </w:drawing>
+              </mc:Choice>
+              <mc:Fallback>
+                <w:pict>
+                  <v:shapetype w14:anchorId="4620340B" id="_x0000_t202" coordsize="21600,21600" o:spt="202" path="m,l,21600r21600,l21600,xe">
+                    <v:stroke joinstyle="miter"/>
+                    <v:path gradientshapeok="t" o:connecttype="rect"/>
+                  </v:shapetype>
+                  <v:shape id="Text Box 159" o:spid="_x0000_s1026" type="#_x0000_t202" style="position:absolute;margin-left:0;margin-top:0;width:8in;height:1in;z-index:251660288;visibility:visible;mso-wrap-style:square;mso-width-percent:941;mso-height-percent:92;mso-top-percent:818;mso-wrap-distance-left:9pt;mso-wrap-distance-top:0;mso-wrap-distance-right:9pt;mso-wrap-distance-bottom:0;mso-position-horizontal:center;mso-position-horizontal-relative:page;mso-position-vertical-relative:page;mso-width-percent:941;mso-height-percent:92;mso-top-percent:818;mso-width-relative:page;mso-height-relative:page;v-text-anchor:bottom" o:gfxdata="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" filled="f" stroked="f" strokeweight=".5pt">
+                    <v:textbox inset="126pt,0,54pt,0">
+                      <w:txbxContent>
+                        <w:sdt>
+                          <w:sdtPr>
+                            <w:rPr>
+                              <w:color w:val="595959" w:themeColor="text1" w:themeTint="A6"/>
+                              <w:sz w:val="28"/>
+                              <w:szCs w:val="28"/>
+                            </w:rPr>
+                            <w:alias w:val="Author"/>
+                            <w:tag w:val=""/>
+                            <w:id w:val="789243997"/>
+                            <w:dataBinding w:prefixMappings="xmlns:ns0='http://purl.org/dc/elements/1.1/' xmlns:ns1='http://schemas.openxmlformats.org/package/2006/metadata/core-properties' " w:xpath="/ns1:coreProperties[1]/ns0:creator[1]" w:storeItemID="{6C3C8BC8-F283-45AE-878A-BAB7291924A1}"/>
+                            <w:text/>
+                          </w:sdtPr>
+                          <w:sdtContent>
+                            <w:p>
+                              <w:pPr>
+                                <w:pStyle w:val="NoSpacing"/>
+                                <w:jc w:val="right"/>
+                                <w:rPr>
+                                  <w:color w:val="595959" w:themeColor="text1" w:themeTint="A6"/>
+                                  <w:sz w:val="28"/>
+                                  <w:szCs w:val="28"/>
+                                </w:rPr>
+                              </w:pPr>
+                              <w:r>
+                                <w:rPr>
+                                  <w:color w:val="595959" w:themeColor="text1" w:themeTint="A6"/>
+                                  <w:sz w:val="28"/>
+                                  <w:szCs w:val="28"/>
+                                </w:rPr>
+                                <w:t>Sameera Lakshan</w:t>
+                              </w:r>
+                            </w:p>
+                          </w:sdtContent>
+                        </w:sdt>
+                        <w:p>
+                          <w:pPr>
+                            <w:pStyle w:val="NoSpacing"/>
+                            <w:jc w:val="right"/>
+                            <w:rPr>
+                              <w:color w:val="595959" w:themeColor="text1" w:themeTint="A6"/>
+                              <w:sz w:val="18"/>
+                              <w:szCs w:val="18"/>
+                            </w:rPr>
+                          </w:pPr>
+                          <w:sdt>
+                            <w:sdtPr>
+                              <w:rPr>
+                                <w:rStyle w:val="Hyperlink"/>
+                                <w:kern w:val="2"/>
+                                <w:sz w:val="24"/>
+                                <w:szCs w:val="24"/>
+                                <w14:ligatures w14:val="standardContextual"/>
+                              </w:rPr>
+                              <w:alias w:val="Email"/>
+                              <w:tag w:val="Email"/>
+                              <w:id w:val="942260680"/>
+                              <w:dataBinding w:prefixMappings="xmlns:ns0='http://schemas.microsoft.com/office/2006/coverPageProps' " w:xpath="/ns0:CoverPageProperties[1]/ns0:CompanyEmail[1]" w:storeItemID="{55AF091B-3C7A-41E3-B477-F2FDAA23CFDA}"/>
+                              <w:text/>
+                            </w:sdtPr>
+                            <w:sdtContent>
+                              <w:hyperlink r:id="rId7" w:history="1">
+                                <w:r>
+                                  <w:rPr>
+                                    <w:rStyle w:val="Hyperlink"/>
+                                    <w:kern w:val="2"/>
+                                    <w:sz w:val="24"/>
+                                    <w:szCs w:val="24"/>
+                                    <w:lang w:eastAsia="zh-CN"/>
+                                    <w14:ligatures w14:val="standardContextual"/>
+                                  </w:rPr>
+                                  <w:t>ms26933474@my.sliit.lk</w:t>
+                                </w:r>
+                              </w:hyperlink>
+                            </w:sdtContent>
+                          </w:sdt>
+                        </w:p>
+                      </w:txbxContent>
+                    </v:textbox>
+                    <w10:wrap type="square" anchorx="page" anchory="page"/>
+                  </v:shape>
+                </w:pict>
+              </mc:Fallback>
+            </mc:AlternateContent>
+          </w:r>
+          <w:r>
+            <w:rPr>
+              <w:noProof/>
+            </w:rPr>
+            <mc:AlternateContent>
+              <mc:Choice Requires="wps">
+                <w:drawing>
+                  <wp:anchor distT="0" distB="0" distL="114300" distR="114300" simplePos="0" relativeHeight="251661312" behindDoc="0" locked="0" layoutInCell="1" allowOverlap="1" wp14:anchorId="39A43E26" wp14:editId="6CF107E7">
+                    <wp:simplePos x="0" y="0"/>
+                    <wp:positionH relativeFrom="page">
+                      <wp:align>center</wp:align>
+                    </wp:positionH>
+                    <mc:AlternateContent>
+                      <mc:Choice Requires="wp14">
+                        <wp:positionV relativeFrom="page">
+                          <wp14:pctPosVOffset>70000</wp14:pctPosVOffset>
+                        </wp:positionV>
+                      </mc:Choice>
+                      <mc:Fallback>
+                        <wp:positionV relativeFrom="page">
+                          <wp:posOffset>7040880</wp:posOffset>
+                        </wp:positionV>
+                      </mc:Fallback>
+                    </mc:AlternateContent>
+                    <wp:extent cx="7315200" cy="1009650"/>
+                    <wp:effectExtent l="0" t="0" r="0" b="0"/>
+                    <wp:wrapSquare wrapText="bothSides"/>
+                    <wp:docPr id="153" name="Text Box 161"/>
+                    <wp:cNvGraphicFramePr/>
+                    <a:graphic xmlns:a="http://schemas.openxmlformats.org/drawingml/2006/main">
+                      <a:graphicData uri="http://schemas.microsoft.com/office/word/2010/wordprocessingShape">
+                        <wps:wsp>
+                          <wps:cNvSpPr txBox="1"/>
+                          <wps:spPr>
+                            <a:xfrm>
+                              <a:off x="0" y="0"/>
+                              <a:ext cx="7315200" cy="1009650"/>
+                            </a:xfrm>
+                            <a:prstGeom prst="rect">
+                              <a:avLst/>
+                            </a:prstGeom>
+                            <a:noFill/>
+                            <a:ln w="6350">
+                              <a:noFill/>
+                            </a:ln>
+                            <a:effectLst/>
+                          </wps:spPr>
+                          <wps:style>
+                            <a:lnRef idx="0">
+                              <a:schemeClr val="accent1"/>
+                            </a:lnRef>
+                            <a:fillRef idx="0">
+                              <a:schemeClr val="accent1"/>
+                            </a:fillRef>
+                            <a:effectRef idx="0">
+                              <a:schemeClr val="accent1"/>
+                            </a:effectRef>
+                            <a:fontRef idx="minor">
+                              <a:schemeClr val="dk1"/>
+                            </a:fontRef>
+                          </wps:style>
+                          <wps:txbx>
+                            <w:txbxContent>
+                              <w:sdt>
+                                <w:sdtPr>
+                                  <w:rPr>
+                                    <w:color w:val="595959" w:themeColor="text1" w:themeTint="A6"/>
+                                    <w:sz w:val="20"/>
+                                    <w:szCs w:val="20"/>
+                                  </w:rPr>
+                                  <w:alias w:val="Abstract"/>
+                                  <w:tag w:val=""/>
+                                  <w:id w:val="1375273687"/>
+                                  <w:dataBinding w:prefixMappings="xmlns:ns0='http://schemas.microsoft.com/office/2006/coverPageProps' " w:xpath="/ns0:CoverPageProperties[1]/ns0:Abstract[1]" w:storeItemID="{55AF091B-3C7A-41E3-B477-F2FDAA23CFDA}"/>
+                                  <w:text w:multiLine="1"/>
+                                </w:sdtPr>
+                                <w:sdtContent>
+                                  <w:p>
+                                    <w:pPr>
+                                      <w:pStyle w:val="NoSpacing"/>
+                                      <w:jc w:val="right"/>
+                                      <w:rPr>
+                                        <w:color w:val="595959" w:themeColor="text1" w:themeTint="A6"/>
+                                        <w:sz w:val="20"/>
+                                        <w:szCs w:val="20"/>
+                                      </w:rPr>
+                                    </w:pPr>
+                                    <w:r>
+                                      <w:rPr>
+                                        <w:color w:val="595959" w:themeColor="text1" w:themeTint="A6"/>
+                                        <w:sz w:val="20"/>
+                                        <w:szCs w:val="20"/>
+                                      </w:rPr>
+                                      <w:t>Exploring Hybrid Mobile Technologies</w:t>
+                                    </w:r>
+                                  </w:p>
+                                </w:sdtContent>
+                              </w:sdt>
+                            </w:txbxContent>
+                          </wps:txbx>
+                          <wps:bodyPr rot="0" spcFirstLastPara="0" vertOverflow="overflow" horzOverflow="overflow" vert="horz" wrap="square" lIns="1600200" tIns="0" rIns="685800" bIns="0" numCol="1" spcCol="0" rtlCol="0" fromWordArt="0" anchor="t" anchorCtr="0" forceAA="0" compatLnSpc="1">
+                            <a:prstTxWarp prst="textNoShape">
+                              <a:avLst/>
+                            </a:prstTxWarp>
+                            <a:spAutoFit/>
+                          </wps:bodyPr>
+                        </wps:wsp>
+                      </a:graphicData>
+                    </a:graphic>
+                    <wp14:sizeRelH relativeFrom="page">
+                      <wp14:pctWidth>94100</wp14:pctWidth>
+                    </wp14:sizeRelH>
+                    <wp14:sizeRelV relativeFrom="page">
+                      <wp14:pctHeight>10000</wp14:pctHeight>
+                    </wp14:sizeRelV>
+                  </wp:anchor>
+                </w:drawing>
+              </mc:Choice>
+              <mc:Fallback>
+                <w:pict>
+                  <v:shape w14:anchorId="39A43E26" id="Text Box 161" o:spid="_x0000_s1027" type="#_x0000_t202" style="position:absolute;margin-left:0;margin-top:0;width:8in;height:79.5pt;z-index:251661312;visibility:visible;mso-wrap-style:square;mso-width-percent:941;mso-height-percent:100;mso-top-percent:700;mso-wrap-distance-left:9pt;mso-wrap-distance-top:0;mso-wrap-distance-right:9pt;mso-wrap-distance-bottom:0;mso-position-horizontal:center;mso-position-horizontal-relative:page;mso-position-vertical-relative:page;mso-width-percent:941;mso-height-percent:100;mso-top-percent:700;mso-width-relative:page;mso-height-relative:page;v-text-anchor:top" o:gfxdata="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" filled="f" stroked="f" strokeweight=".5pt">
+                    <v:textbox style="mso-fit-shape-to-text:t" inset="126pt,0,54pt,0">
+                      <w:txbxContent>
+                        <w:sdt>
+                          <w:sdtPr>
+                            <w:rPr>
+                              <w:color w:val="595959" w:themeColor="text1" w:themeTint="A6"/>
+                              <w:sz w:val="20"/>
+                              <w:szCs w:val="20"/>
+                            </w:rPr>
+                            <w:alias w:val="Abstract"/>
+                            <w:tag w:val=""/>
+                            <w:id w:val="1375273687"/>
+                            <w:dataBinding w:prefixMappings="xmlns:ns0='http://schemas.microsoft.com/office/2006/coverPageProps' " w:xpath="/ns0:CoverPageProperties[1]/ns0:Abstract[1]" w:storeItemID="{55AF091B-3C7A-41E3-B477-F2FDAA23CFDA}"/>
+                            <w:text w:multiLine="1"/>
+                          </w:sdtPr>
+                          <w:sdtContent>
+                            <w:p>
+                              <w:pPr>
+                                <w:pStyle w:val="NoSpacing"/>
+                                <w:jc w:val="right"/>
+                                <w:rPr>
+                                  <w:color w:val="595959" w:themeColor="text1" w:themeTint="A6"/>
+                                  <w:sz w:val="20"/>
+                                  <w:szCs w:val="20"/>
+                                </w:rPr>
+                              </w:pPr>
+                              <w:r>
+                                <w:rPr>
+                                  <w:color w:val="595959" w:themeColor="text1" w:themeTint="A6"/>
+                                  <w:sz w:val="20"/>
+                                  <w:szCs w:val="20"/>
+                                </w:rPr>
+                                <w:t>Exploring Hybrid Mobile Technologies</w:t>
+                              </w:r>
+                            </w:p>
+                          </w:sdtContent>
+                        </w:sdt>
+                      </w:txbxContent>
+                    </v:textbox>
+                    <w10:wrap type="square" anchorx="page" anchory="page"/>
+                  </v:shape>
+                </w:pict>
+              </mc:Fallback>
+            </mc:AlternateContent>
+          </w:r>
+          <w:r>
+            <w:rPr>
+              <w:noProof/>
+            </w:rPr>
+            <mc:AlternateContent>
+              <mc:Choice Requires="wps">
+                <w:drawing>
+                  <wp:anchor distT="0" distB="0" distL="114300" distR="114300" simplePos="0" relativeHeight="251659264" behindDoc="0" locked="0" layoutInCell="1" allowOverlap="1" wp14:anchorId="75C9096C" wp14:editId="3C7B72A4">
+                    <wp:simplePos x="0" y="0"/>
+                    <wp:positionH relativeFrom="page">
+                      <wp:align>center</wp:align>
+                    </wp:positionH>
+                    <mc:AlternateContent>
+                      <mc:Choice Requires="wp14">
+                        <wp:positionV relativeFrom="page">
+                          <wp14:pctPosVOffset>30000</wp14:pctPosVOffset>
+                        </wp:positionV>
+                      </mc:Choice>
+                      <mc:Fallback>
+                        <wp:positionV relativeFrom="page">
+                          <wp:posOffset>3017520</wp:posOffset>
+                        </wp:positionV>
+                      </mc:Fallback>
+                    </mc:AlternateContent>
+                    <wp:extent cx="7315200" cy="3638550"/>
+                    <wp:effectExtent l="0" t="0" r="0" b="6350"/>
+                    <wp:wrapSquare wrapText="bothSides"/>
+                    <wp:docPr id="154" name="Text Box 163"/>
+                    <wp:cNvGraphicFramePr/>
+                    <a:graphic xmlns:a="http://schemas.openxmlformats.org/drawingml/2006/main">
+                      <a:graphicData uri="http://schemas.microsoft.com/office/word/2010/wordprocessingShape">
+                        <wps:wsp>
+                          <wps:cNvSpPr txBox="1"/>
+                          <wps:spPr>
+                            <a:xfrm>
+                              <a:off x="0" y="0"/>
+                              <a:ext cx="7315200" cy="3638550"/>
+                            </a:xfrm>
+                            <a:prstGeom prst="rect">
+                              <a:avLst/>
+                            </a:prstGeom>
+                            <a:noFill/>
+                            <a:ln w="6350">
+                              <a:noFill/>
+                            </a:ln>
+                            <a:effectLst/>
+                          </wps:spPr>
+                          <wps:style>
+                            <a:lnRef idx="0">
+                              <a:schemeClr val="accent1"/>
+                            </a:lnRef>
+                            <a:fillRef idx="0">
+                              <a:schemeClr val="accent1"/>
+                            </a:fillRef>
+                            <a:effectRef idx="0">
+                              <a:schemeClr val="accent1"/>
+                            </a:effectRef>
+                            <a:fontRef idx="minor">
+                              <a:schemeClr val="dk1"/>
+                            </a:fontRef>
+                          </wps:style>
+                          <wps:txbx>
+                            <w:txbxContent>
+                              <w:p>
+                                <w:pPr>
+                                  <w:jc w:val="right"/>
+                                  <w:rPr>
+                                    <w:smallCaps/>
+                                    <w:color w:val="404040" w:themeColor="text1" w:themeTint="BF"/>
+                                    <w:sz w:val="36"/>
+                                    <w:szCs w:val="36"/>
+                                  </w:rPr>
+                                </w:pPr>
+                                <w:r>
+                                  <w:rPr>
+                                    <w:caps/>
+                                    <w:noProof/>
+                                    <w:color w:val="156082" w:themeColor="accent1"/>
+                                    <w:sz w:val="64"/>
+                                    <w:szCs w:val="64"/>
+                                  </w:rPr>
+                                  <w:drawing>
+                                    <wp:inline distT="0" distB="0" distL="0" distR="0" wp14:anchorId="642A39B9" wp14:editId="4D0EF946">
+                                      <wp:extent cx="5021580" cy="715010"/>
+                                      <wp:effectExtent l="0" t="0" r="7620" b="8890"/>
+                                      <wp:docPr id="463517234" name="Picture 1"/>
+                                      <wp:cNvGraphicFramePr>
+                                        <a:graphicFrameLocks xmlns:a="http://schemas.openxmlformats.org/drawingml/2006/main" noChangeAspect="1"/>
+                                      </wp:cNvGraphicFramePr>
+                                      <a:graphic xmlns:a="http://schemas.openxmlformats.org/drawingml/2006/main">
+                                        <a:graphicData uri="http://schemas.openxmlformats.org/drawingml/2006/picture">
+                                          <pic:pic xmlns:pic="http://schemas.openxmlformats.org/drawingml/2006/picture">
+                                            <pic:nvPicPr>
+                                              <pic:cNvPr id="0" name="Picture 1"/>
+                                              <pic:cNvPicPr>
+                                                <a:picLocks noChangeAspect="1" noChangeArrowheads="1"/>
+                                              </pic:cNvPicPr>
+                                            </pic:nvPicPr>
+                                            <pic:blipFill>
+                                              <a:blip r:embed="rId8">
+                                                <a:extLst>
+                                                  <a:ext uri="{28A0092B-C50C-407E-A947-70E740481C1C}">
+                                                    <a14:useLocalDpi xmlns:a14="http://schemas.microsoft.com/office/drawing/2010/main" val="0"/>
+                                                  </a:ext>
+                                                </a:extLst>
+                                              </a:blip>
+                                              <a:srcRect/>
+                                              <a:stretch>
+                                                <a:fillRect/>
+                                              </a:stretch>
+                                            </pic:blipFill>
+                                            <pic:spPr bwMode="auto">
+                                              <a:xfrm>
+                                                <a:off x="0" y="0"/>
+                                                <a:ext cx="5021580" cy="715010"/>
+                                              </a:xfrm>
+                                              <a:prstGeom prst="rect">
+                                                <a:avLst/>
+                                              </a:prstGeom>
+                                              <a:noFill/>
+                                              <a:ln>
+                                                <a:noFill/>
+                                              </a:ln>
+                                            </pic:spPr>
+                                          </pic:pic>
+                                        </a:graphicData>
+                                      </a:graphic>
+                                    </wp:inline>
+                                  </w:drawing>
+                                </w:r>
+                                <w:sdt>
+                                  <w:sdtPr>
+                                    <w:rPr>
+                                      <w:caps/>
+                                      <w:color w:val="156082" w:themeColor="accent1"/>
+                                      <w:sz w:val="48"/>
+                                      <w:szCs w:val="48"/>
+                                    </w:rPr>
+                                    <w:alias w:val="Subtitle"/>
+                                    <w:tag w:val=""/>
+                                    <w:id w:val="1759551507"/>
+                                    <w:dataBinding w:prefixMappings="xmlns:ns0='http://purl.org/dc/elements/1.1/' xmlns:ns1='http://schemas.openxmlformats.org/package/2006/metadata/core-properties' " w:xpath="/ns1:coreProperties[1]/ns0:subject[1]" w:storeItemID="{6C3C8BC8-F283-45AE-878A-BAB7291924A1}"/>
+                                    <w:text/>
+                                  </w:sdtPr>
+                                  <w:sdtContent>
+                                    <w:r>
+                                      <w:rPr>
+                                        <w:caps/>
+                                        <w:color w:val="156082" w:themeColor="accent1"/>
+                                        <w:sz w:val="48"/>
+                                        <w:szCs w:val="48"/>
+                                      </w:rPr>
+                                      <w:t>ENTERPRISE MOBILITY</w:t>
+                                    </w:r>
+                                  </w:sdtContent>
+                                </w:sdt>
+                              </w:p>
+                            </w:txbxContent>
+                          </wps:txbx>
+                          <wps:bodyPr rot="0" spcFirstLastPara="0" vertOverflow="overflow" horzOverflow="overflow" vert="horz" wrap="square" lIns="1600200" tIns="0" rIns="685800" bIns="0" numCol="1" spcCol="0" rtlCol="0" fromWordArt="0" anchor="b" anchorCtr="0" forceAA="0" compatLnSpc="1">
+                            <a:prstTxWarp prst="textNoShape">
+                              <a:avLst/>
+                            </a:prstTxWarp>
+                            <a:noAutofit/>
+                          </wps:bodyPr>
+                        </wps:wsp>
+                      </a:graphicData>
+                    </a:graphic>
+                    <wp14:sizeRelH relativeFrom="page">
+                      <wp14:pctWidth>94100</wp14:pctWidth>
+                    </wp14:sizeRelH>
+                    <wp14:sizeRelV relativeFrom="page">
+                      <wp14:pctHeight>36300</wp14:pctHeight>
+                    </wp14:sizeRelV>
+                  </wp:anchor>
+                </w:drawing>
+              </mc:Choice>
+              <mc:Fallback>
+                <w:pict>
+                  <v:shape w14:anchorId="75C9096C" id="Text Box 163" o:spid="_x0000_s1028" type="#_x0000_t202" style="position:absolute;margin-left:0;margin-top:0;width:8in;height:286.5pt;z-index:251659264;visibility:visible;mso-wrap-style:square;mso-width-percent:941;mso-height-percent:363;mso-top-percent:300;mso-wrap-distance-left:9pt;mso-wrap-distance-top:0;mso-wrap-distance-right:9pt;mso-wrap-distance-bottom:0;mso-position-horizontal:center;mso-position-horizontal-relative:page;mso-position-vertical-relative:page;mso-width-percent:941;mso-height-percent:363;mso-top-percent:300;mso-width-relative:page;mso-height-relative:page;v-text-anchor:bottom" o:gfxdata="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" filled="f" stroked="f" strokeweight=".5pt">
+                    <v:textbox inset="126pt,0,54pt,0">
+                      <w:txbxContent>
+                        <w:p>
+                          <w:pPr>
+                            <w:jc w:val="right"/>
+                            <w:rPr>
+                              <w:smallCaps/>
+                              <w:color w:val="404040" w:themeColor="text1" w:themeTint="BF"/>
+                              <w:sz w:val="36"/>
+                              <w:szCs w:val="36"/>
+                            </w:rPr>
+                          </w:pPr>
+                          <w:r>
+                            <w:rPr>
+                              <w:caps/>
+                              <w:noProof/>
+                              <w:color w:val="156082" w:themeColor="accent1"/>
+                              <w:sz w:val="64"/>
+                              <w:szCs w:val="64"/>
+                            </w:rPr>
+                            <w:drawing>
+                              <wp:inline distT="0" distB="0" distL="0" distR="0" wp14:anchorId="642A39B9" wp14:editId="4D0EF946">
+                                <wp:extent cx="5021580" cy="715010"/>
+                                <wp:effectExtent l="0" t="0" r="7620" b="8890"/>
+                                <wp:docPr id="463517234" name="Picture 1"/>
+                                <wp:cNvGraphicFramePr>
+                                  <a:graphicFrameLocks xmlns:a="http://schemas.openxmlformats.org/drawingml/2006/main" noChangeAspect="1"/>
+                                </wp:cNvGraphicFramePr>
+                                <a:graphic xmlns:a="http://schemas.openxmlformats.org/drawingml/2006/main">
+                                  <a:graphicData uri="http://schemas.openxmlformats.org/drawingml/2006/picture">
+                                    <pic:pic xmlns:pic="http://schemas.openxmlformats.org/drawingml/2006/picture">
+                                      <pic:nvPicPr>
+                                        <pic:cNvPr id="0" name="Picture 1"/>
+                                        <pic:cNvPicPr>
+                                          <a:picLocks noChangeAspect="1" noChangeArrowheads="1"/>
+                                        </pic:cNvPicPr>
+                                      </pic:nvPicPr>
+                                      <pic:blipFill>
+                                        <a:blip r:embed="rId8">
+                                          <a:extLst>
+                                            <a:ext uri="{28A0092B-C50C-407E-A947-70E740481C1C}">
+                                              <a14:useLocalDpi xmlns:a14="http://schemas.microsoft.com/office/drawing/2010/main" val="0"/>
+                                            </a:ext>
+                                          </a:extLst>
+                                        </a:blip>
+                                        <a:srcRect/>
+                                        <a:stretch>
+                                          <a:fillRect/>
+                                        </a:stretch>
+                                      </pic:blipFill>
+                                      <pic:spPr bwMode="auto">
+                                        <a:xfrm>
+                                          <a:off x="0" y="0"/>
+                                          <a:ext cx="5021580" cy="715010"/>
+                                        </a:xfrm>
+                                        <a:prstGeom prst="rect">
+                                          <a:avLst/>
+                                        </a:prstGeom>
+                                        <a:noFill/>
+                                        <a:ln>
+                                          <a:noFill/>
+                                        </a:ln>
+                                      </pic:spPr>
+                                    </pic:pic>
+                                  </a:graphicData>
+                                </a:graphic>
+                              </wp:inline>
+                            </w:drawing>
+                          </w:r>
+                          <w:sdt>
+                            <w:sdtPr>
+                              <w:rPr>
+                                <w:caps/>
+                                <w:color w:val="156082" w:themeColor="accent1"/>
+                                <w:sz w:val="48"/>
+                                <w:szCs w:val="48"/>
+                              </w:rPr>
+                              <w:alias w:val="Subtitle"/>
+                              <w:tag w:val=""/>
+                              <w:id w:val="1759551507"/>
+                              <w:dataBinding w:prefixMappings="xmlns:ns0='http://purl.org/dc/elements/1.1/' xmlns:ns1='http://schemas.openxmlformats.org/package/2006/metadata/core-properties' " w:xpath="/ns1:coreProperties[1]/ns0:subject[1]" w:storeItemID="{6C3C8BC8-F283-45AE-878A-BAB7291924A1}"/>
+                              <w:text/>
+                            </w:sdtPr>
+                            <w:sdtContent>
+                              <w:r>
+                                <w:rPr>
+                                  <w:caps/>
+                                  <w:color w:val="156082" w:themeColor="accent1"/>
+                                  <w:sz w:val="48"/>
+                                  <w:szCs w:val="48"/>
+                                </w:rPr>
+                                <w:t>ENTERPRISE MOBILITY</w:t>
+                              </w:r>
+                            </w:sdtContent>
+                          </w:sdt>
+                        </w:p>
+                      </w:txbxContent>
+                    </v:textbox>
+                    <w10:wrap type="square" anchorx="page" anchory="page"/>
+                  </v:shape>
+                </w:pict>
+              </mc:Fallback>
+            </mc:AlternateContent>
+          </w:r>
+        </w:p>
+        <w:p>
+          <w:pPr>
+            <w:rPr>
+              <w:rFonts w:asciiTheme="majorHAnsi" w:eastAsiaTheme="majorEastAsia" w:hAnsiTheme="majorHAnsi" w:cstheme="majorBidi"/>
+              <w:color w:val="0F4761" w:themeColor="accent1" w:themeShade="BF"/>
+              <w:sz w:val="32"/>
+              <w:szCs w:val="32"/>
+            </w:rPr>
+          </w:pPr>
+          <w:r>
+            <w:rPr>
+              <w:noProof/>
+            </w:rPr>
+            <w:drawing>
+              <wp:anchor distT="0" distB="0" distL="114300" distR="114300" simplePos="0" relativeHeight="251663360" behindDoc="1" locked="0" layoutInCell="1" allowOverlap="1" wp14:anchorId="3F4AA581" wp14:editId="16EDA194">
+                <wp:simplePos x="0" y="0"/>
+                <wp:positionH relativeFrom="margin">
+                  <wp:align>center</wp:align>
+                </wp:positionH>
+                <wp:positionV relativeFrom="paragraph">
+                  <wp:posOffset>6985</wp:posOffset>
+                </wp:positionV>
+                <wp:extent cx="2244725" cy="2811145"/>
+                <wp:effectExtent l="0" t="0" r="3175" b="8255"/>
+                <wp:wrapTight wrapText="bothSides">
+                  <wp:wrapPolygon edited="0">
+                    <wp:start x="0" y="0"/>
+                    <wp:lineTo x="0" y="15223"/>
+                    <wp:lineTo x="367" y="16394"/>
+                    <wp:lineTo x="2566" y="18736"/>
+                    <wp:lineTo x="8249" y="21078"/>
+                    <wp:lineTo x="9899" y="21517"/>
+                    <wp:lineTo x="11365" y="21517"/>
+                    <wp:lineTo x="18698" y="18882"/>
+                    <wp:lineTo x="21081" y="16540"/>
+                    <wp:lineTo x="21447" y="15223"/>
+                    <wp:lineTo x="21447" y="0"/>
+                    <wp:lineTo x="0" y="0"/>
+                  </wp:wrapPolygon>
+                </wp:wrapTight>
+                <wp:docPr id="32743986" name="Picture 1"/>
+                <wp:cNvGraphicFramePr>
+                  <a:graphicFrameLocks xmlns:a="http://schemas.openxmlformats.org/drawingml/2006/main" noChangeAspect="1"/>
+                </wp:cNvGraphicFramePr>
+                <a:graphic xmlns:a="http://schemas.openxmlformats.org/drawingml/2006/main">
+                  <a:graphicData uri="http://schemas.openxmlformats.org/drawingml/2006/picture">
+                    <pic:pic xmlns:pic="http://schemas.openxmlformats.org/drawingml/2006/picture">
+                      <pic:nvPicPr>
+                        <pic:cNvPr id="32743986" name="Picture 32743986"/>
+                        <pic:cNvPicPr/>
+                      </pic:nvPicPr>
+                      <pic:blipFill>
+                        <a:blip r:embed="rId9">
+                          <a:extLst>
+                            <a:ext uri="{28A0092B-C50C-407E-A947-70E740481C1C}">
+                              <a14:useLocalDpi xmlns:a14="http://schemas.microsoft.com/office/drawing/2010/main" val="0"/>
+                            </a:ext>
+                          </a:extLst>
+                        </a:blip>
+                        <a:stretch>
+                          <a:fillRect/>
+                        </a:stretch>
+                      </pic:blipFill>
+                      <pic:spPr>
+                        <a:xfrm>
+                          <a:off x="0" y="0"/>
+                          <a:ext cx="2244725" cy="2811145"/>
+                        </a:xfrm>
+                        <a:prstGeom prst="rect">
+                          <a:avLst/>
+                        </a:prstGeom>
+                      </pic:spPr>
+                    </pic:pic>
+                  </a:graphicData>
+                </a:graphic>
+                <wp14:sizeRelH relativeFrom="margin">
+                  <wp14:pctWidth>0</wp14:pctWidth>
+                </wp14:sizeRelH>
+                <wp14:sizeRelV relativeFrom="margin">
+                  <wp14:pctHeight>0</wp14:pctHeight>
+                </wp14:sizeRelV>
+              </wp:anchor>
+            </w:drawing>
+          </w:r>
+          <w:r>
+            <w:br w:type="page"/>
+          </w:r>
+        </w:p>
+      </w:sdtContent>
+    </w:sdt>
+    <w:sdt>
+      <w:sdtPr>
+        <w:id w:val="-179274989"/>
+        <w:docPartObj>
+          <w:docPartGallery w:val="Table of Contents"/>
+          <w:docPartUnique/>
+        </w:docPartObj>
+      </w:sdtPr>
+      <w:sdtEndPr>
+        <w:rPr>
+          <w:rFonts w:asciiTheme="minorHAnsi" w:eastAsiaTheme="minorEastAsia" w:hAnsiTheme="minorHAnsi" w:cstheme="minorBidi"/>
+          <w:b/>
+          <w:bCs/>
+          <w:noProof/>
+          <w:color w:val="auto"/>
+          <w:kern w:val="2"/>
+          <w:sz w:val="24"/>
+          <w:szCs w:val="24"/>
+          <w:lang w:eastAsia="zh-CN"/>
+          <w14:ligatures w14:val="standardContextual"/>
+        </w:rPr>
+      </w:sdtEndPr>
+      <w:sdtContent>
+        <w:p>
+          <w:pPr>
+            <w:pStyle w:val="TOCHeading"/>
+          </w:pPr>
+          <w:r>
+            <w:t>Contents</w:t>
+          </w:r>
+        </w:p>
+        <w:p>
+          <w:pPr>
+            <w:pStyle w:val="TOC2"/>
+            <w:tabs>
+              <w:tab w:val="right" w:leader="dot" w:pos="9350"/>
+            </w:tabs>
+            <w:rPr>
+              <w:noProof/>
+            </w:rPr>
+          </w:pPr>
+          <w:r>
+            <w:fldChar w:fldCharType="begin"/>
+          </w:r>
+          <w:r>
+            <w:instrText xml:space="preserve"> TOC \o "1-3" \h \z \u </w:instrText>
+          </w:r>
+          <w:r>
+            <w:fldChar w:fldCharType="separate"/>
+          </w:r>
+          <w:hyperlink w:anchor="_Toc237657107" w:history="1">
+            <w:r>
+              <w:rPr>
+                <w:rStyle w:val="Hyperlink"/>
+                <w:noProof/>
+              </w:rPr>
+              <w:t>Installing Cordova</w:t>
+            </w:r>
+            <w:r>
+              <w:rPr>
+                <w:noProof/>
+                <w:webHidden/>
+              </w:rPr>
+              <w:tab/>
+            </w:r>
+            <w:r>
+              <w:rPr>
+                <w:noProof/>
+                <w:webHidden/>
+              </w:rPr>
+              <w:fldChar w:fldCharType="begin"/>
+            </w:r>
+            <w:r>
+              <w:rPr>
+                <w:noProof/>
+                <w:webHidden/>
+              </w:rPr>
+              <w:instrText xml:space="preserve"> PAGEREF _Toc237657107 \h </w:instrText>
+            </w:r>
+            <w:r>
+              <w:rPr>
+                <w:noProof/>
+                <w:webHidden/>
+              </w:rPr>
+            </w:r>
+            <w:r>
+              <w:rPr>
+                <w:noProof/>
+                <w:webHidden/>
+              </w:rPr>
+              <w:fldChar w:fldCharType="separate"/>
+            </w:r>
+            <w:r>
+              <w:rPr>
+                <w:noProof/>
+                <w:webHidden/>
+              </w:rPr>
+              <w:t>1</w:t>
+            </w:r>
+            <w:r>
+              <w:rPr>
+                <w:noProof/>
+                <w:webHidden/>
+              </w:rPr>
+              <w:fldChar w:fldCharType="end"/>
+            </w:r>
+          </w:hyperlink>
+        </w:p>
+        <w:p>
+          <w:pPr>
+            <w:pStyle w:val="TOC2"/>
+            <w:tabs>
+              <w:tab w:val="right" w:leader="dot" w:pos="9350"/>
+            </w:tabs>
+            <w:rPr>
+              <w:noProof/>
+            </w:rPr>
+          </w:pPr>
+          <w:hyperlink w:anchor="_Toc237657108" w:history="1">
+            <w:r>
+              <w:rPr>
+                <w:rStyle w:val="Hyperlink"/>
+                <w:noProof/>
+              </w:rPr>
+              <w:t>Exploring Ionic</w:t>
+            </w:r>
+            <w:r>
+              <w:rPr>
+                <w:noProof/>
+                <w:webHidden/>
+              </w:rPr>
+              <w:tab/>
+            </w:r>
+            <w:r>
+              <w:rPr>
+                <w:noProof/>
+                <w:webHidden/>
+              </w:rPr>
+              <w:fldChar w:fldCharType="begin"/>
+            </w:r>
+            <w:r>
+              <w:rPr>
+                <w:noProof/>
+                <w:webHidden/>
+              </w:rPr>
+              <w:instrText xml:space="preserve"> PAGEREF _Toc237657108 \h </w:instrText>
+            </w:r>
+            <w:r>
+              <w:rPr>
+                <w:noProof/>
+                <w:webHidden/>
+              </w:rPr>
+            </w:r>
+            <w:r>
+              <w:rPr>
+                <w:noProof/>
+                <w:webHidden/>
+              </w:rPr>
+              <w:fldChar w:fldCharType="separate"/>
+            </w:r>
+            <w:r>
+              <w:rPr>
+                <w:noProof/>
+                <w:webHidden/>
+              </w:rPr>
+              <w:t>6</w:t>
+            </w:r>
+            <w:r>
+              <w:rPr>
+                <w:noProof/>
+                <w:webHidden/>
+              </w:rPr>
+              <w:fldChar w:fldCharType="end"/>
+            </w:r>
+          </w:hyperlink>
+        </w:p>
+        <w:p>
+          <w:r>
+            <w:rPr>
+              <w:b/>
+              <w:bCs/>
+              <w:noProof/>
+            </w:rPr>
+            <w:fldChar w:fldCharType="end"/>
+          </w:r>
+        </w:p>
+      </w:sdtContent>
+    </w:sdt>
+    <w:p>
+      <w:pPr>
+        <w:rPr>
+          <w:rFonts w:asciiTheme="majorHAnsi" w:eastAsiaTheme="majorEastAsia" w:hAnsiTheme="majorHAnsi" w:cstheme="majorBidi"/>
+          <w:color w:val="0F4761" w:themeColor="accent1" w:themeShade="BF"/>
+          <w:sz w:val="32"/>
+          <w:szCs w:val="32"/>
+        </w:rPr>
+      </w:pPr>
+      <w:bookmarkStart w:id="0" w:name="_Toc237657107"/>
+      <w:r>
+        <w:br w:type="page"/>
+      </w:r>
+    </w:p>
+    <w:p>
+      <w:pPr>
+        <w:pStyle w:val="TableofFigures"/>
+        <w:tabs>
+          <w:tab w:val="right" w:leader="dot" w:pos="9350"/>
+        </w:tabs>
+        <w:rPr>
+          <w:noProof/>
+        </w:rPr>
+      </w:pPr>
+      <w:r>
+        <w:lastRenderedPageBreak/>
+        <w:fldChar w:fldCharType="begin"/>
+      </w:r>
+      <w:r>
+        <w:instrText xml:space="preserve"> TOC \h \z \c "Figure" </w:instrText>
+      </w:r>
+      <w:r>
+        <w:fldChar w:fldCharType="separate"/>
+      </w:r>
+      <w:hyperlink w:anchor="_Toc237657128" w:history="1">
+        <w:r>
+          <w:rPr>
+            <w:rStyle w:val="Hyperlink"/>
+            <w:noProof/>
+          </w:rPr>
+          <w:t>Figure 1: Installing Cordova</w:t>
+        </w:r>
+        <w:r>
+          <w:rPr>
+            <w:noProof/>
+            <w:webHidden/>
+          </w:rPr>
+          <w:tab/>
+        </w:r>
+        <w:r>
+          <w:rPr>
+            <w:noProof/>
+            <w:webHidden/>
+          </w:rPr>
+          <w:fldChar w:fldCharType="begin"/>
+        </w:r>
+        <w:r>
+          <w:rPr>
+            <w:noProof/>
+            <w:webHidden/>
+          </w:rPr>
+          <w:instrText xml:space="preserve"> PAGEREF _Toc237657128 \h </w:instrText>
+        </w:r>
+        <w:r>
+          <w:rPr>
+            <w:noProof/>
+            <w:webHidden/>
+          </w:rPr>
+        </w:r>
+        <w:r>
+          <w:rPr>
+            <w:noProof/>
+            <w:webHidden/>
+          </w:rPr>
+          <w:fldChar w:fldCharType="separate"/>
+        </w:r>
+        <w:r>
+          <w:rPr>
+            <w:noProof/>
+            <w:webHidden/>
+          </w:rPr>
+          <w:t>2</w:t>
+        </w:r>
+        <w:r>
+          <w:rPr>
+            <w:noProof/>
+            <w:webHidden/>
+          </w:rPr>
+          <w:fldChar w:fldCharType="end"/>
+        </w:r>
+      </w:hyperlink>
+    </w:p>
+    <w:p>
+      <w:pPr>
+        <w:pStyle w:val="TableofFigures"/>
+        <w:tabs>
+          <w:tab w:val="right" w:leader="dot" w:pos="9350"/>
+        </w:tabs>
+        <w:rPr>
+          <w:noProof/>
+        </w:rPr>
+      </w:pPr>
+      <w:hyperlink w:anchor="_Toc237657129" w:history="1">
+        <w:r>
+          <w:rPr>
+            <w:rStyle w:val="Hyperlink"/>
+            <w:noProof/>
+          </w:rPr>
+          <w:t>Figure 2: Verifying the  Installation of Cordova</w:t>
+        </w:r>
+        <w:r>
+          <w:rPr>
+            <w:noProof/>
+            <w:webHidden/>
+          </w:rPr>
+          <w:tab/>
+        </w:r>
+        <w:r>
+          <w:rPr>
+            <w:noProof/>
+            <w:webHidden/>
+          </w:rPr>
+          <w:fldChar w:fldCharType="begin"/>
+        </w:r>
+        <w:r>
+          <w:rPr>
+            <w:noProof/>
+            <w:webHidden/>
+          </w:rPr>
+          <w:instrText xml:space="preserve"> PAGEREF _Toc237657129 \h </w:instrText>
+        </w:r>
+        <w:r>
+          <w:rPr>
+            <w:noProof/>
+            <w:webHidden/>
+          </w:rPr>
+        </w:r>
+        <w:r>
+          <w:rPr>
+            <w:noProof/>
+            <w:webHidden/>
+          </w:rPr>
+          <w:fldChar w:fldCharType="separate"/>
+        </w:r>
+        <w:r>
+          <w:rPr>
+            <w:noProof/>
+            <w:webHidden/>
+          </w:rPr>
+          <w:t>2</w:t>
+        </w:r>
+        <w:r>
+          <w:rPr>
+            <w:noProof/>
+            <w:webHidden/>
+          </w:rPr>
+          <w:fldChar w:fldCharType="end"/>
+        </w:r>
+      </w:hyperlink>
+    </w:p>
+    <w:p>
+      <w:pPr>
+        <w:pStyle w:val="TableofFigures"/>
+        <w:tabs>
+          <w:tab w:val="right" w:leader="dot" w:pos="9350"/>
+        </w:tabs>
+        <w:rPr>
+          <w:noProof/>
+        </w:rPr>
+      </w:pPr>
+      <w:hyperlink w:anchor="_Toc237657130" w:history="1">
+        <w:r>
+          <w:rPr>
+            <w:rStyle w:val="Hyperlink"/>
+            <w:noProof/>
+          </w:rPr>
+          <w:t>Figure 3: Creating new Cordova project</w:t>
+        </w:r>
+        <w:r>
+          <w:rPr>
+            <w:noProof/>
+            <w:webHidden/>
+          </w:rPr>
+          <w:tab/>
+        </w:r>
+        <w:r>
+          <w:rPr>
+            <w:noProof/>
+            <w:webHidden/>
+          </w:rPr>
+          <w:fldChar w:fldCharType="begin"/>
+        </w:r>
+        <w:r>
+          <w:rPr>
+            <w:noProof/>
+            <w:webHidden/>
+          </w:rPr>
+          <w:instrText xml:space="preserve"> PAGEREF _Toc237657130 \h </w:instrText>
+        </w:r>
+        <w:r>
+          <w:rPr>
+            <w:noProof/>
+            <w:webHidden/>
+          </w:rPr>
+        </w:r>
+        <w:r>
+          <w:rPr>
+            <w:noProof/>
+            <w:webHidden/>
+          </w:rPr>
+          <w:fldChar w:fldCharType="separate"/>
+        </w:r>
+        <w:r>
+          <w:rPr>
+            <w:noProof/>
+            <w:webHidden/>
+          </w:rPr>
+          <w:t>2</w:t>
+        </w:r>
+        <w:r>
+          <w:rPr>
+            <w:noProof/>
+            <w:webHidden/>
+          </w:rPr>
+          <w:fldChar w:fldCharType="end"/>
+        </w:r>
+      </w:hyperlink>
+    </w:p>
+    <w:p>
+      <w:pPr>
+        <w:pStyle w:val="TableofFigures"/>
+        <w:tabs>
+          <w:tab w:val="right" w:leader="dot" w:pos="9350"/>
+        </w:tabs>
+        <w:rPr>
+          <w:noProof/>
+        </w:rPr>
+      </w:pPr>
+      <w:hyperlink w:anchor="_Toc237657131" w:history="1">
+        <w:r>
+          <w:rPr>
+            <w:rStyle w:val="Hyperlink"/>
+            <w:noProof/>
+          </w:rPr>
+          <w:t>Figure 4: Adding platforms for the target Application</w:t>
+        </w:r>
+        <w:r>
+          <w:rPr>
+            <w:noProof/>
+            <w:webHidden/>
+          </w:rPr>
+          <w:tab/>
+        </w:r>
+        <w:r>
+          <w:rPr>
+            <w:noProof/>
+            <w:webHidden/>
+          </w:rPr>
+          <w:fldChar w:fldCharType="begin"/>
+        </w:r>
+        <w:r>
+          <w:rPr>
+            <w:noProof/>
+            <w:webHidden/>
+          </w:rPr>
+          <w:instrText xml:space="preserve"> PAGEREF _Toc237657131 \h </w:instrText>
+        </w:r>
+        <w:r>
+          <w:rPr>
+            <w:noProof/>
+            <w:webHidden/>
+          </w:rPr>
+        </w:r>
+        <w:r>
+          <w:rPr>
+            <w:noProof/>
+            <w:webHidden/>
+          </w:rPr>
+          <w:fldChar w:fldCharType="separate"/>
+        </w:r>
+        <w:r>
+          <w:rPr>
+            <w:noProof/>
+            <w:webHidden/>
+          </w:rPr>
+          <w:t>3</w:t>
+        </w:r>
+        <w:r>
+          <w:rPr>
+            <w:noProof/>
+            <w:webHidden/>
+          </w:rPr>
+          <w:fldChar w:fldCharType="end"/>
+        </w:r>
+      </w:hyperlink>
+    </w:p>
+    <w:p>
+      <w:pPr>
+        <w:pStyle w:val="TableofFigures"/>
+        <w:tabs>
+          <w:tab w:val="right" w:leader="dot" w:pos="9350"/>
+        </w:tabs>
+        <w:rPr>
+          <w:noProof/>
+        </w:rPr>
+      </w:pPr>
+      <w:hyperlink w:anchor="_Toc237657132" w:history="1">
+        <w:r>
+          <w:rPr>
+            <w:rStyle w:val="Hyperlink"/>
+            <w:noProof/>
+          </w:rPr>
+          <w:t>Figure 5: Listing current platforms</w:t>
+        </w:r>
+        <w:r>
+          <w:rPr>
+            <w:noProof/>
+            <w:webHidden/>
+          </w:rPr>
+          <w:tab/>
+        </w:r>
+        <w:r>
+          <w:rPr>
+            <w:noProof/>
+            <w:webHidden/>
+          </w:rPr>
+          <w:fldChar w:fldCharType="begin"/>
+        </w:r>
+        <w:r>
+          <w:rPr>
+            <w:noProof/>
+            <w:webHidden/>
+          </w:rPr>
+          <w:instrText xml:space="preserve"> PAGEREF _Toc237657132 \h </w:instrText>
+        </w:r>
+        <w:r>
+          <w:rPr>
+            <w:noProof/>
+            <w:webHidden/>
+          </w:rPr>
+        </w:r>
+        <w:r>
+          <w:rPr>
+            <w:noProof/>
+            <w:webHidden/>
+          </w:rPr>
+          <w:fldChar w:fldCharType="separate"/>
+        </w:r>
+        <w:r>
+          <w:rPr>
+            <w:noProof/>
+            <w:webHidden/>
+          </w:rPr>
+          <w:t>3</w:t>
+        </w:r>
+        <w:r>
+          <w:rPr>
+            <w:noProof/>
+            <w:webHidden/>
+          </w:rPr>
+          <w:fldChar w:fldCharType="end"/>
+        </w:r>
+      </w:hyperlink>
+    </w:p>
+    <w:p>
+      <w:pPr>
+        <w:pStyle w:val="TableofFigures"/>
+        <w:tabs>
+          <w:tab w:val="right" w:leader="dot" w:pos="9350"/>
+        </w:tabs>
+        <w:rPr>
+          <w:noProof/>
+        </w:rPr>
+      </w:pPr>
+      <w:hyperlink w:anchor="_Toc237657133" w:history="1">
+        <w:r>
+          <w:rPr>
+            <w:rStyle w:val="Hyperlink"/>
+            <w:noProof/>
+          </w:rPr>
+          <w:t>Figure 6: Checking requirements</w:t>
+        </w:r>
+        <w:r>
+          <w:rPr>
+            <w:noProof/>
+            <w:webHidden/>
+          </w:rPr>
+          <w:tab/>
+        </w:r>
+        <w:r>
+          <w:rPr>
+            <w:noProof/>
+            <w:webHidden/>
+          </w:rPr>
+          <w:fldChar w:fldCharType="begin"/>
+        </w:r>
+        <w:r>
+          <w:rPr>
+            <w:noProof/>
+            <w:webHidden/>
+          </w:rPr>
+          <w:instrText xml:space="preserve"> PAGEREF _Toc237657133 \h </w:instrText>
+        </w:r>
+        <w:r>
+          <w:rPr>
+            <w:noProof/>
+            <w:webHidden/>
+          </w:rPr>
+        </w:r>
+        <w:r>
+          <w:rPr>
+            <w:noProof/>
+            <w:webHidden/>
+          </w:rPr>
+          <w:fldChar w:fldCharType="separate"/>
+        </w:r>
+        <w:r>
+          <w:rPr>
+            <w:noProof/>
+            <w:webHidden/>
+          </w:rPr>
+          <w:t>4</w:t>
+        </w:r>
+        <w:r>
+          <w:rPr>
+            <w:noProof/>
+            <w:webHidden/>
+          </w:rPr>
+          <w:fldChar w:fldCharType="end"/>
+        </w:r>
+      </w:hyperlink>
+    </w:p>
+    <w:p>
+      <w:pPr>
+        <w:pStyle w:val="TableofFigures"/>
+        <w:tabs>
+          <w:tab w:val="right" w:leader="dot" w:pos="9350"/>
+        </w:tabs>
+        <w:rPr>
+          <w:noProof/>
+        </w:rPr>
+      </w:pPr>
+      <w:hyperlink w:anchor="_Toc237657134" w:history="1">
+        <w:r>
+          <w:rPr>
+            <w:rStyle w:val="Hyperlink"/>
+            <w:noProof/>
+          </w:rPr>
+          <w:t>Figure 7: Build Cordova application – 1</w:t>
+        </w:r>
+        <w:r>
+          <w:rPr>
+            <w:noProof/>
+            <w:webHidden/>
+          </w:rPr>
+          <w:tab/>
+        </w:r>
+        <w:r>
+          <w:rPr>
+            <w:noProof/>
+            <w:webHidden/>
+          </w:rPr>
+          <w:fldChar w:fldCharType="begin"/>
+        </w:r>
+        <w:r>
+          <w:rPr>
+            <w:noProof/>
+            <w:webHidden/>
+          </w:rPr>
+          <w:instrText xml:space="preserve"> PAGEREF _Toc237657134 \h </w:instrText>
+        </w:r>
+        <w:r>
+          <w:rPr>
+            <w:noProof/>
+            <w:webHidden/>
+          </w:rPr>
+        </w:r>
+        <w:r>
+          <w:rPr>
+            <w:noProof/>
+            <w:webHidden/>
+          </w:rPr>
+          <w:fldChar w:fldCharType="separate"/>
+        </w:r>
+        <w:r>
+          <w:rPr>
+            <w:noProof/>
+            <w:webHidden/>
+          </w:rPr>
+          <w:t>4</w:t>
+        </w:r>
+        <w:r>
+          <w:rPr>
+            <w:noProof/>
+            <w:webHidden/>
+          </w:rPr>
+          <w:fldChar w:fldCharType="end"/>
+        </w:r>
+      </w:hyperlink>
+    </w:p>
+    <w:p>
+      <w:pPr>
+        <w:pStyle w:val="TableofFigures"/>
+        <w:tabs>
+          <w:tab w:val="right" w:leader="dot" w:pos="9350"/>
+        </w:tabs>
+        <w:rPr>
+          <w:noProof/>
+        </w:rPr>
+      </w:pPr>
+      <w:hyperlink w:anchor="_Toc237657135" w:history="1">
+        <w:r>
+          <w:rPr>
+            <w:rStyle w:val="Hyperlink"/>
+            <w:noProof/>
+          </w:rPr>
+          <w:t>Figure 8: Build Cordova application – 2</w:t>
+        </w:r>
+        <w:r>
+          <w:rPr>
+            <w:noProof/>
+            <w:webHidden/>
+          </w:rPr>
+          <w:tab/>
+        </w:r>
+        <w:r>
+          <w:rPr>
+            <w:noProof/>
+            <w:webHidden/>
+          </w:rPr>
+          <w:fldChar w:fldCharType="begin"/>
+        </w:r>
+        <w:r>
+          <w:rPr>
+            <w:noProof/>
+            <w:webHidden/>
+          </w:rPr>
+          <w:instrText xml:space="preserve"> PAGEREF _Toc237657135 \h </w:instrText>
+        </w:r>
+        <w:r>
+          <w:rPr>
+            <w:noProof/>
+            <w:webHidden/>
+          </w:rPr>
+        </w:r>
+        <w:r>
+          <w:rPr>
+            <w:noProof/>
+            <w:webHidden/>
+          </w:rPr>
+          <w:fldChar w:fldCharType="separate"/>
+        </w:r>
+        <w:r>
+          <w:rPr>
+            <w:noProof/>
+            <w:webHidden/>
+          </w:rPr>
+          <w:t>5</w:t>
+        </w:r>
+        <w:r>
+          <w:rPr>
+            <w:noProof/>
+            <w:webHidden/>
+          </w:rPr>
+          <w:fldChar w:fldCharType="end"/>
+        </w:r>
+      </w:hyperlink>
+    </w:p>
+    <w:p>
+      <w:pPr>
+        <w:pStyle w:val="TableofFigures"/>
+        <w:tabs>
+          <w:tab w:val="right" w:leader="dot" w:pos="9350"/>
+        </w:tabs>
+        <w:rPr>
+          <w:noProof/>
+        </w:rPr>
+      </w:pPr>
+      <w:hyperlink w:anchor="_Toc237657136" w:history="1">
+        <w:r>
+          <w:rPr>
+            <w:rStyle w:val="Hyperlink"/>
+            <w:noProof/>
+          </w:rPr>
+          <w:t>Figure 9: Run Cordova Application</w:t>
+        </w:r>
+        <w:r>
+          <w:rPr>
+            <w:noProof/>
+            <w:webHidden/>
+          </w:rPr>
+          <w:tab/>
+        </w:r>
+        <w:r>
+          <w:rPr>
+            <w:noProof/>
+            <w:webHidden/>
+          </w:rPr>
+          <w:fldChar w:fldCharType="begin"/>
+        </w:r>
+        <w:r>
+          <w:rPr>
+            <w:noProof/>
+            <w:webHidden/>
+          </w:rPr>
+          <w:instrText xml:space="preserve"> PAGEREF _Toc237657136 \h </w:instrText>
+        </w:r>
+        <w:r>
+          <w:rPr>
+            <w:noProof/>
+            <w:webHidden/>
+          </w:rPr>
+        </w:r>
+        <w:r>
+          <w:rPr>
+            <w:noProof/>
+            <w:webHidden/>
+          </w:rPr>
+          <w:fldChar w:fldCharType="separate"/>
+        </w:r>
+        <w:r>
+          <w:rPr>
+            <w:noProof/>
+            <w:webHidden/>
+          </w:rPr>
+          <w:t>5</w:t>
+        </w:r>
+        <w:r>
+          <w:rPr>
+            <w:noProof/>
+            <w:webHidden/>
+          </w:rPr>
+          <w:fldChar w:fldCharType="end"/>
+        </w:r>
+      </w:hyperlink>
+    </w:p>
+    <w:p>
+      <w:pPr>
+        <w:pStyle w:val="TableofFigures"/>
+        <w:tabs>
+          <w:tab w:val="right" w:leader="dot" w:pos="9350"/>
+        </w:tabs>
+        <w:rPr>
+          <w:noProof/>
+        </w:rPr>
+      </w:pPr>
+      <w:hyperlink w:anchor="_Toc237657137" w:history="1">
+        <w:r>
+          <w:rPr>
+            <w:rStyle w:val="Hyperlink"/>
+            <w:noProof/>
+          </w:rPr>
+          <w:t>Figure 10: Cordova build successful</w:t>
+        </w:r>
+        <w:r>
+          <w:rPr>
+            <w:noProof/>
+            <w:webHidden/>
+          </w:rPr>
+          <w:tab/>
+        </w:r>
+        <w:r>
+          <w:rPr>
+            <w:noProof/>
+            <w:webHidden/>
+          </w:rPr>
+          <w:fldChar w:fldCharType="begin"/>
+        </w:r>
+        <w:r>
+          <w:rPr>
+            <w:noProof/>
+            <w:webHidden/>
+          </w:rPr>
+          <w:instrText xml:space="preserve"> PAGEREF _Toc237657137 \h </w:instrText>
+        </w:r>
+        <w:r>
+          <w:rPr>
+            <w:noProof/>
+            <w:webHidden/>
+          </w:rPr>
+        </w:r>
+        <w:r>
+          <w:rPr>
+            <w:noProof/>
+            <w:webHidden/>
+          </w:rPr>
+          <w:fldChar w:fldCharType="separate"/>
+        </w:r>
+        <w:r>
+          <w:rPr>
+            <w:noProof/>
+            <w:webHidden/>
+          </w:rPr>
+          <w:t>6</w:t>
+        </w:r>
+        <w:r>
+          <w:rPr>
+            <w:noProof/>
+            <w:webHidden/>
+          </w:rPr>
+          <w:fldChar w:fldCharType="end"/>
+        </w:r>
+      </w:hyperlink>
+    </w:p>
+    <w:p>
+      <w:pPr>
+        <w:pStyle w:val="TableofFigures"/>
+        <w:tabs>
+          <w:tab w:val="right" w:leader="dot" w:pos="9350"/>
+        </w:tabs>
+        <w:rPr>
+          <w:noProof/>
+        </w:rPr>
+      </w:pPr>
+      <w:hyperlink w:anchor="_Toc237657138" w:history="1">
+        <w:r>
+          <w:rPr>
+            <w:rStyle w:val="Hyperlink"/>
+            <w:noProof/>
+          </w:rPr>
+          <w:t>Figure 11: Application in Emulator</w:t>
+        </w:r>
+        <w:r>
+          <w:rPr>
+            <w:noProof/>
+            <w:webHidden/>
+          </w:rPr>
+          <w:tab/>
+        </w:r>
+        <w:r>
+          <w:rPr>
+            <w:noProof/>
+            <w:webHidden/>
+          </w:rPr>
+          <w:fldChar w:fldCharType="begin"/>
+        </w:r>
+        <w:r>
+          <w:rPr>
+            <w:noProof/>
+            <w:webHidden/>
+          </w:rPr>
+          <w:instrText xml:space="preserve"> PAGEREF _Toc237657138 \h </w:instrText>
+        </w:r>
+        <w:r>
+          <w:rPr>
+            <w:noProof/>
+            <w:webHidden/>
+          </w:rPr>
+        </w:r>
+        <w:r>
+          <w:rPr>
+            <w:noProof/>
+            <w:webHidden/>
+          </w:rPr>
+          <w:fldChar w:fldCharType="separate"/>
+        </w:r>
+        <w:r>
+          <w:rPr>
+            <w:noProof/>
+            <w:webHidden/>
+          </w:rPr>
+          <w:t>6</w:t>
+        </w:r>
+        <w:r>
+          <w:rPr>
+            <w:noProof/>
+            <w:webHidden/>
+          </w:rPr>
+          <w:fldChar w:fldCharType="end"/>
+        </w:r>
+      </w:hyperlink>
+    </w:p>
+    <w:p>
+      <w:pPr>
+        <w:pStyle w:val="TableofFigures"/>
+        <w:tabs>
+          <w:tab w:val="right" w:leader="dot" w:pos="9350"/>
+        </w:tabs>
+        <w:rPr>
+          <w:noProof/>
+        </w:rPr>
+      </w:pPr>
+      <w:hyperlink w:anchor="_Toc237657139" w:history="1">
+        <w:r>
+          <w:rPr>
+            <w:rStyle w:val="Hyperlink"/>
+            <w:noProof/>
+          </w:rPr>
+          <w:t>Figure 12: Starting the application electron platform</w:t>
+        </w:r>
+        <w:r>
+          <w:rPr>
+            <w:noProof/>
+            <w:webHidden/>
+          </w:rPr>
+          <w:tab/>
+        </w:r>
+        <w:r>
+          <w:rPr>
+            <w:noProof/>
+            <w:webHidden/>
+          </w:rPr>
+          <w:fldChar w:fldCharType="begin"/>
+        </w:r>
+        <w:r>
+          <w:rPr>
+            <w:noProof/>
+            <w:webHidden/>
+          </w:rPr>
+          <w:instrText xml:space="preserve"> PAGEREF _Toc237657139 \h </w:instrText>
+        </w:r>
+        <w:r>
+          <w:rPr>
+            <w:noProof/>
+            <w:webHidden/>
+          </w:rPr>
+        </w:r>
+        <w:r>
+          <w:rPr>
+            <w:noProof/>
+            <w:webHidden/>
+          </w:rPr>
+          <w:fldChar w:fldCharType="separate"/>
+        </w:r>
+        <w:r>
+          <w:rPr>
+            <w:noProof/>
+            <w:webHidden/>
+          </w:rPr>
+          <w:t>7</w:t>
+        </w:r>
+        <w:r>
+          <w:rPr>
+            <w:noProof/>
+            <w:webHidden/>
+          </w:rPr>
+          <w:fldChar w:fldCharType="end"/>
+        </w:r>
+      </w:hyperlink>
+    </w:p>
+    <w:p>
+      <w:pPr>
+        <w:pStyle w:val="TableofFigures"/>
+        <w:tabs>
+          <w:tab w:val="right" w:leader="dot" w:pos="9350"/>
+        </w:tabs>
+        <w:rPr>
+          <w:noProof/>
+        </w:rPr>
+      </w:pPr>
+      <w:hyperlink w:anchor="_Toc237657140" w:history="1">
+        <w:r>
+          <w:rPr>
+            <w:rStyle w:val="Hyperlink"/>
+            <w:noProof/>
+          </w:rPr>
+          <w:t>Figure 13: Application in electron platform</w:t>
+        </w:r>
+        <w:r>
+          <w:rPr>
+            <w:noProof/>
+            <w:webHidden/>
+          </w:rPr>
+          <w:tab/>
+        </w:r>
+        <w:r>
+          <w:rPr>
+            <w:noProof/>
+            <w:webHidden/>
+          </w:rPr>
+          <w:fldChar w:fldCharType="begin"/>
+        </w:r>
+        <w:r>
+          <w:rPr>
+            <w:noProof/>
+            <w:webHidden/>
+          </w:rPr>
+          <w:instrText xml:space="preserve"> PAGEREF _Toc237657140 \h </w:instrText>
+        </w:r>
+        <w:r>
+          <w:rPr>
+            <w:noProof/>
+            <w:webHidden/>
+          </w:rPr>
+        </w:r>
+        <w:r>
+          <w:rPr>
+            <w:noProof/>
+            <w:webHidden/>
+          </w:rPr>
+          <w:fldChar w:fldCharType="separate"/>
+        </w:r>
+        <w:r>
+          <w:rPr>
+            <w:noProof/>
+            <w:webHidden/>
+          </w:rPr>
+          <w:t>7</w:t>
+        </w:r>
+        <w:r>
+          <w:rPr>
+            <w:noProof/>
+            <w:webHidden/>
+          </w:rPr>
+          <w:fldChar w:fldCharType="end"/>
+        </w:r>
+      </w:hyperlink>
+    </w:p>
+    <w:p>
+      <w:pPr>
+        <w:pStyle w:val="TableofFigures"/>
+        <w:tabs>
+          <w:tab w:val="right" w:leader="dot" w:pos="9350"/>
+        </w:tabs>
+        <w:rPr>
+          <w:noProof/>
+        </w:rPr>
+      </w:pPr>
+      <w:hyperlink w:anchor="_Toc237657141" w:history="1">
+        <w:r>
+          <w:rPr>
+            <w:rStyle w:val="Hyperlink"/>
+            <w:noProof/>
+          </w:rPr>
+          <w:t>Figure 14: Installing Ionic</w:t>
+        </w:r>
+        <w:r>
+          <w:rPr>
+            <w:noProof/>
+            <w:webHidden/>
+          </w:rPr>
+          <w:tab/>
+        </w:r>
+        <w:r>
+          <w:rPr>
+            <w:noProof/>
+            <w:webHidden/>
+          </w:rPr>
+          <w:fldChar w:fldCharType="begin"/>
+        </w:r>
+        <w:r>
+          <w:rPr>
+            <w:noProof/>
+            <w:webHidden/>
+          </w:rPr>
+          <w:instrText xml:space="preserve"> PAGEREF _Toc237657141 \h </w:instrText>
+        </w:r>
+        <w:r>
+          <w:rPr>
+            <w:noProof/>
+            <w:webHidden/>
+          </w:rPr>
+        </w:r>
+        <w:r>
+          <w:rPr>
+            <w:noProof/>
+            <w:webHidden/>
+          </w:rPr>
+          <w:fldChar w:fldCharType="separate"/>
+        </w:r>
+        <w:r>
+          <w:rPr>
+            <w:noProof/>
+            <w:webHidden/>
+          </w:rPr>
+          <w:t>8</w:t>
+        </w:r>
+        <w:r>
+          <w:rPr>
+            <w:noProof/>
+            <w:webHidden/>
+          </w:rPr>
+          <w:fldChar w:fldCharType="end"/>
+        </w:r>
+      </w:hyperlink>
+    </w:p>
+    <w:p>
+      <w:pPr>
+        <w:pStyle w:val="TableofFigures"/>
+        <w:tabs>
+          <w:tab w:val="right" w:leader="dot" w:pos="9350"/>
+        </w:tabs>
+        <w:rPr>
+          <w:noProof/>
+        </w:rPr>
+      </w:pPr>
+      <w:hyperlink w:anchor="_Toc237657142" w:history="1">
+        <w:r>
+          <w:rPr>
+            <w:rStyle w:val="Hyperlink"/>
+            <w:noProof/>
+          </w:rPr>
+          <w:t>Figure 15: Photo Gallery Application -1</w:t>
+        </w:r>
+        <w:r>
+          <w:rPr>
+            <w:noProof/>
+            <w:webHidden/>
+          </w:rPr>
+          <w:tab/>
+        </w:r>
+        <w:r>
+          <w:rPr>
+            <w:noProof/>
+            <w:webHidden/>
+          </w:rPr>
+          <w:fldChar w:fldCharType="begin"/>
+        </w:r>
+        <w:r>
+          <w:rPr>
+            <w:noProof/>
+            <w:webHidden/>
+          </w:rPr>
+          <w:instrText xml:space="preserve"> PAGEREF _Toc237657142 \h </w:instrText>
+        </w:r>
+        <w:r>
+          <w:rPr>
+            <w:noProof/>
+            <w:webHidden/>
+          </w:rPr>
+        </w:r>
+        <w:r>
+          <w:rPr>
+            <w:noProof/>
+            <w:webHidden/>
+          </w:rPr>
+          <w:fldChar w:fldCharType="separate"/>
+        </w:r>
+        <w:r>
+          <w:rPr>
+            <w:noProof/>
+            <w:webHidden/>
+          </w:rPr>
+          <w:t>8</w:t>
+        </w:r>
+        <w:r>
+          <w:rPr>
+            <w:noProof/>
+            <w:webHidden/>
+          </w:rPr>
+          <w:fldChar w:fldCharType="end"/>
+        </w:r>
+      </w:hyperlink>
+    </w:p>
+    <w:p>
+      <w:pPr>
+        <w:pStyle w:val="TableofFigures"/>
+        <w:tabs>
+          <w:tab w:val="right" w:leader="dot" w:pos="9350"/>
+        </w:tabs>
+        <w:rPr>
+          <w:noProof/>
+        </w:rPr>
+      </w:pPr>
+      <w:hyperlink w:anchor="_Toc237657143" w:history="1">
+        <w:r>
+          <w:rPr>
+            <w:rStyle w:val="Hyperlink"/>
+            <w:noProof/>
+          </w:rPr>
+          <w:t>Figure 16: Photo Gallery Application -2</w:t>
+        </w:r>
+        <w:r>
+          <w:rPr>
+            <w:noProof/>
+            <w:webHidden/>
+          </w:rPr>
+          <w:tab/>
+        </w:r>
+        <w:r>
+          <w:rPr>
+            <w:noProof/>
+            <w:webHidden/>
+          </w:rPr>
+          <w:fldChar w:fldCharType="begin"/>
+        </w:r>
+        <w:r>
+          <w:rPr>
+            <w:noProof/>
+            <w:webHidden/>
+          </w:rPr>
+          <w:instrText xml:space="preserve"> PAGEREF _Toc237657143 \h </w:instrText>
+        </w:r>
+        <w:r>
+          <w:rPr>
+            <w:noProof/>
+            <w:webHidden/>
+          </w:rPr>
+        </w:r>
+        <w:r>
+          <w:rPr>
+            <w:noProof/>
+            <w:webHidden/>
+          </w:rPr>
+          <w:fldChar w:fldCharType="separate"/>
+        </w:r>
+        <w:r>
+          <w:rPr>
+            <w:noProof/>
+            <w:webHidden/>
+          </w:rPr>
+          <w:t>9</w:t>
+        </w:r>
+        <w:r>
+          <w:rPr>
+            <w:noProof/>
+            <w:webHidden/>
+          </w:rPr>
+          <w:fldChar w:fldCharType="end"/>
+        </w:r>
+      </w:hyperlink>
+    </w:p>
+    <w:p>
+      <w:pPr>
+        <w:pStyle w:val="Heading2"/>
+      </w:pPr>
+      <w:r>
+        <w:fldChar w:fldCharType="end"/>
+      </w:r>
+    </w:p>
+    <w:p>
+      <w:pPr>
+        <w:rPr>
+          <w:rFonts w:asciiTheme="majorHAnsi" w:eastAsiaTheme="majorEastAsia" w:hAnsiTheme="majorHAnsi" w:cstheme="majorBidi"/>
+          <w:color w:val="0F4761" w:themeColor="accent1" w:themeShade="BF"/>
+          <w:sz w:val="32"/>
+          <w:szCs w:val="32"/>
+        </w:rPr>
+      </w:pPr>
+      <w:r>
+        <w:br w:type="page"/>
+      </w:r>
+    </w:p>
+    <w:p>
+      <w:pPr>
+        <w:pStyle w:val="Heading2"/>
+      </w:pPr>
+      <w:r>
+        <w:lastRenderedPageBreak/>
+        <w:t xml:space="preserve">Installing </w:t>
+      </w:r>
+      <w:r>
+        <w:t>C</w:t>
+      </w:r>
+      <w:r>
+        <w:t>ordova</w:t>
+      </w:r>
+      <w:bookmarkEnd w:id="0"/>
     </w:p>
     <w:p>
       <w:pPr>
         <w:keepNext/>
       </w:pPr>
       <w:r>
+        <w:rPr>
+          <w:noProof/>
+        </w:rPr>
         <w:drawing>
           <wp:inline distT="0" distB="0" distL="0" distR="0" wp14:anchorId="1EC37A51" wp14:editId="2D8AAAA6">
             <wp:extent cx="5905500" cy="1101844"/>
@@ -28,7 +2168,7 @@
                     <pic:cNvPicPr/>
                   </pic:nvPicPr>
                   <pic:blipFill>
-                    <a:blip r:embed="rId4"/>
+                    <a:blip r:embed="rId10"/>
                     <a:stretch>
                       <a:fillRect/>
                     </a:stretch>
@@ -54,6 +2194,7 @@
         <w:pStyle w:val="Caption"/>
         <w:jc w:val="center"/>
       </w:pPr>
+      <w:bookmarkStart w:id="1" w:name="_Toc237657128"/>
       <w:r>
         <w:t xml:space="preserve">Figure </w:t>
       </w:r>
@@ -78,12 +2219,16 @@
       <w:r>
         <w:t>: Installing Cordova</w:t>
       </w:r>
+      <w:bookmarkEnd w:id="1"/>
     </w:p>
     <w:p>
       <w:pPr>
         <w:keepNext/>
       </w:pPr>
       <w:r>
+        <w:rPr>
+          <w:noProof/>
+        </w:rPr>
         <w:drawing>
           <wp:inline distT="0" distB="0" distL="0" distR="0" wp14:anchorId="5F9DF699" wp14:editId="5E92E93C">
             <wp:extent cx="5943600" cy="579120"/>
@@ -100,7 +2245,7 @@
                     <pic:cNvPicPr/>
                   </pic:nvPicPr>
                   <pic:blipFill>
-                    <a:blip r:embed="rId5"/>
+                    <a:blip r:embed="rId11"/>
                     <a:stretch>
                       <a:fillRect/>
                     </a:stretch>
@@ -129,6 +2274,7 @@
           <w:noProof/>
         </w:rPr>
       </w:pPr>
+      <w:bookmarkStart w:id="2" w:name="_Toc237657129"/>
       <w:r>
         <w:t xml:space="preserve">Figure </w:t>
       </w:r>
@@ -159,6 +2305,7 @@
         </w:rPr>
         <w:t xml:space="preserve"> Installation of Cordova</w:t>
       </w:r>
+      <w:bookmarkEnd w:id="2"/>
     </w:p>
     <w:p/>
     <w:p>
@@ -166,6 +2313,9 @@
         <w:keepNext/>
       </w:pPr>
       <w:r>
+        <w:rPr>
+          <w:noProof/>
+        </w:rPr>
         <w:drawing>
           <wp:inline distT="0" distB="0" distL="0" distR="0" wp14:anchorId="4400478D" wp14:editId="0B63140B">
             <wp:extent cx="5943600" cy="977265"/>
@@ -182,7 +2332,7 @@
                     <pic:cNvPicPr/>
                   </pic:nvPicPr>
                   <pic:blipFill>
-                    <a:blip r:embed="rId6"/>
+                    <a:blip r:embed="rId12"/>
                     <a:stretch>
                       <a:fillRect/>
                     </a:stretch>
@@ -208,6 +2358,7 @@
         <w:pStyle w:val="Caption"/>
         <w:jc w:val="center"/>
       </w:pPr>
+      <w:bookmarkStart w:id="3" w:name="_Toc237657130"/>
       <w:r>
         <w:t xml:space="preserve">Figure </w:t>
       </w:r>
@@ -238,12 +2389,16 @@
       <w:r>
         <w:t>ordova project</w:t>
       </w:r>
+      <w:bookmarkEnd w:id="3"/>
     </w:p>
     <w:p>
       <w:pPr>
         <w:keepNext/>
       </w:pPr>
       <w:r>
+        <w:rPr>
+          <w:noProof/>
+        </w:rPr>
         <w:drawing>
           <wp:inline distT="0" distB="0" distL="0" distR="0" wp14:anchorId="5D7326CC" wp14:editId="660B7CD2">
             <wp:extent cx="5943600" cy="2863850"/>
@@ -260,7 +2415,7 @@
                     <pic:cNvPicPr/>
                   </pic:nvPicPr>
                   <pic:blipFill>
-                    <a:blip r:embed="rId7"/>
+                    <a:blip r:embed="rId13"/>
                     <a:stretch>
                       <a:fillRect/>
                     </a:stretch>
@@ -286,6 +2441,7 @@
         <w:pStyle w:val="Caption"/>
         <w:jc w:val="center"/>
       </w:pPr>
+      <w:bookmarkStart w:id="4" w:name="_Toc237657131"/>
       <w:r>
         <w:t xml:space="preserve">Figure </w:t>
       </w:r>
@@ -310,6 +2466,7 @@
       <w:r>
         <w:t>: Adding platforms for the target Application</w:t>
       </w:r>
+      <w:bookmarkEnd w:id="4"/>
     </w:p>
     <w:p/>
     <w:p>
@@ -317,6 +2474,9 @@
         <w:keepNext/>
       </w:pPr>
       <w:r>
+        <w:rPr>
+          <w:noProof/>
+        </w:rPr>
         <w:lastRenderedPageBreak/>
         <w:drawing>
           <wp:inline distT="0" distB="0" distL="0" distR="0" wp14:anchorId="4D0AB200" wp14:editId="49671DB7">
@@ -334,7 +2494,7 @@
                     <pic:cNvPicPr/>
                   </pic:nvPicPr>
                   <pic:blipFill>
-                    <a:blip r:embed="rId8"/>
+                    <a:blip r:embed="rId14"/>
                     <a:stretch>
                       <a:fillRect/>
                     </a:stretch>
@@ -360,6 +2520,7 @@
         <w:pStyle w:val="Caption"/>
         <w:jc w:val="center"/>
       </w:pPr>
+      <w:bookmarkStart w:id="5" w:name="_Toc237657132"/>
       <w:r>
         <w:t xml:space="preserve">Figure </w:t>
       </w:r>
@@ -384,12 +2545,16 @@
       <w:r>
         <w:t>: Listing current platforms</w:t>
       </w:r>
+      <w:bookmarkEnd w:id="5"/>
     </w:p>
     <w:p>
       <w:pPr>
         <w:keepNext/>
       </w:pPr>
       <w:r>
+        <w:rPr>
+          <w:noProof/>
+        </w:rPr>
         <w:drawing>
           <wp:inline distT="0" distB="0" distL="0" distR="0" wp14:anchorId="472601DB" wp14:editId="1A0D2CCC">
             <wp:extent cx="5943600" cy="2174875"/>
@@ -406,7 +2571,7 @@
                     <pic:cNvPicPr/>
                   </pic:nvPicPr>
                   <pic:blipFill>
-                    <a:blip r:embed="rId9"/>
+                    <a:blip r:embed="rId15"/>
                     <a:stretch>
                       <a:fillRect/>
                     </a:stretch>
@@ -432,6 +2597,7 @@
         <w:pStyle w:val="Caption"/>
         <w:jc w:val="center"/>
       </w:pPr>
+      <w:bookmarkStart w:id="6" w:name="_Toc237657133"/>
       <w:r>
         <w:t xml:space="preserve">Figure </w:t>
       </w:r>
@@ -456,12 +2622,16 @@
       <w:r>
         <w:t>: Checking requirements</w:t>
       </w:r>
+      <w:bookmarkEnd w:id="6"/>
     </w:p>
     <w:p>
       <w:pPr>
         <w:keepNext/>
       </w:pPr>
       <w:r>
+        <w:rPr>
+          <w:noProof/>
+        </w:rPr>
         <w:drawing>
           <wp:inline distT="0" distB="0" distL="0" distR="0" wp14:anchorId="032D95B5" wp14:editId="55098C24">
             <wp:extent cx="6002267" cy="2533650"/>
@@ -478,7 +2648,7 @@
                     <pic:cNvPicPr/>
                   </pic:nvPicPr>
                   <pic:blipFill>
-                    <a:blip r:embed="rId10"/>
+                    <a:blip r:embed="rId16"/>
                     <a:stretch>
                       <a:fillRect/>
                     </a:stretch>
@@ -504,6 +2674,7 @@
         <w:pStyle w:val="Caption"/>
         <w:jc w:val="center"/>
       </w:pPr>
+      <w:bookmarkStart w:id="7" w:name="_Toc237657134"/>
       <w:r>
         <w:t xml:space="preserve">Figure </w:t>
       </w:r>
@@ -528,12 +2699,16 @@
       <w:r>
         <w:t>: Build Cordova application – 1</w:t>
       </w:r>
+      <w:bookmarkEnd w:id="7"/>
     </w:p>
     <w:p>
       <w:pPr>
         <w:keepNext/>
       </w:pPr>
       <w:r>
+        <w:rPr>
+          <w:noProof/>
+        </w:rPr>
         <w:lastRenderedPageBreak/>
         <w:drawing>
           <wp:inline distT="0" distB="0" distL="0" distR="0" wp14:anchorId="2259B916" wp14:editId="49169EC2">
@@ -551,7 +2726,7 @@
                     <pic:cNvPicPr/>
                   </pic:nvPicPr>
                   <pic:blipFill>
-                    <a:blip r:embed="rId11"/>
+                    <a:blip r:embed="rId17"/>
                     <a:stretch>
                       <a:fillRect/>
                     </a:stretch>
@@ -577,6 +2752,7 @@
         <w:pStyle w:val="Caption"/>
         <w:jc w:val="center"/>
       </w:pPr>
+      <w:bookmarkStart w:id="8" w:name="_Toc237657135"/>
       <w:r>
         <w:t xml:space="preserve">Figure </w:t>
       </w:r>
@@ -607,11 +2783,642 @@
       <w:r>
         <w:t>2</w:t>
       </w:r>
+      <w:bookmarkEnd w:id="8"/>
+    </w:p>
+    <w:p/>
+    <w:p>
+      <w:pPr>
+        <w:keepNext/>
+      </w:pPr>
+      <w:r>
+        <w:drawing>
+          <wp:inline distT="0" distB="0" distL="0" distR="0" wp14:anchorId="0ED2338C" wp14:editId="394D1F8C">
+            <wp:extent cx="5943600" cy="2723515"/>
+            <wp:effectExtent l="0" t="0" r="0" b="635"/>
+            <wp:docPr id="226804922" name="Picture 1"/>
+            <wp:cNvGraphicFramePr>
+              <a:graphicFrameLocks xmlns:a="http://schemas.openxmlformats.org/drawingml/2006/main" noChangeAspect="1"/>
+            </wp:cNvGraphicFramePr>
+            <a:graphic xmlns:a="http://schemas.openxmlformats.org/drawingml/2006/main">
+              <a:graphicData uri="http://schemas.openxmlformats.org/drawingml/2006/picture">
+                <pic:pic xmlns:pic="http://schemas.openxmlformats.org/drawingml/2006/picture">
+                  <pic:nvPicPr>
+                    <pic:cNvPr id="226804922" name=""/>
+                    <pic:cNvPicPr/>
+                  </pic:nvPicPr>
+                  <pic:blipFill>
+                    <a:blip r:embed="rId18"/>
+                    <a:stretch>
+                      <a:fillRect/>
+                    </a:stretch>
+                  </pic:blipFill>
+                  <pic:spPr>
+                    <a:xfrm>
+                      <a:off x="0" y="0"/>
+                      <a:ext cx="5943600" cy="2723515"/>
+                    </a:xfrm>
+                    <a:prstGeom prst="rect">
+                      <a:avLst/>
+                    </a:prstGeom>
+                  </pic:spPr>
+                </pic:pic>
+              </a:graphicData>
+            </a:graphic>
+          </wp:inline>
+        </w:drawing>
+      </w:r>
+    </w:p>
+    <w:p>
+      <w:pPr>
+        <w:pStyle w:val="Caption"/>
+        <w:jc w:val="center"/>
+      </w:pPr>
+      <w:bookmarkStart w:id="9" w:name="_Toc237657136"/>
+      <w:r>
+        <w:t xml:space="preserve">Figure </w:t>
+      </w:r>
+      <w:r>
+        <w:fldChar w:fldCharType="begin"/>
+      </w:r>
+      <w:r>
+        <w:instrText xml:space="preserve"> SEQ Figure \* ARABIC </w:instrText>
+      </w:r>
+      <w:r>
+        <w:fldChar w:fldCharType="separate"/>
+      </w:r>
+      <w:r>
+        <w:rPr>
+          <w:noProof/>
+        </w:rPr>
+        <w:t>9</w:t>
+      </w:r>
+      <w:r>
+        <w:fldChar w:fldCharType="end"/>
+      </w:r>
+      <w:r>
+        <w:t>: Run Cordova Application</w:t>
+      </w:r>
+      <w:bookmarkEnd w:id="9"/>
+    </w:p>
+    <w:p/>
+    <w:p>
+      <w:pPr>
+        <w:keepNext/>
+      </w:pPr>
+      <w:r>
+        <w:lastRenderedPageBreak/>
+        <w:drawing>
+          <wp:inline distT="0" distB="0" distL="0" distR="0" wp14:anchorId="24BA8BB3" wp14:editId="07146AFB">
+            <wp:extent cx="5943600" cy="2908300"/>
+            <wp:effectExtent l="0" t="0" r="0" b="6350"/>
+            <wp:docPr id="1799803243" name="Picture 1"/>
+            <wp:cNvGraphicFramePr>
+              <a:graphicFrameLocks xmlns:a="http://schemas.openxmlformats.org/drawingml/2006/main" noChangeAspect="1"/>
+            </wp:cNvGraphicFramePr>
+            <a:graphic xmlns:a="http://schemas.openxmlformats.org/drawingml/2006/main">
+              <a:graphicData uri="http://schemas.openxmlformats.org/drawingml/2006/picture">
+                <pic:pic xmlns:pic="http://schemas.openxmlformats.org/drawingml/2006/picture">
+                  <pic:nvPicPr>
+                    <pic:cNvPr id="1799803243" name=""/>
+                    <pic:cNvPicPr/>
+                  </pic:nvPicPr>
+                  <pic:blipFill>
+                    <a:blip r:embed="rId19"/>
+                    <a:stretch>
+                      <a:fillRect/>
+                    </a:stretch>
+                  </pic:blipFill>
+                  <pic:spPr>
+                    <a:xfrm>
+                      <a:off x="0" y="0"/>
+                      <a:ext cx="5943600" cy="2908300"/>
+                    </a:xfrm>
+                    <a:prstGeom prst="rect">
+                      <a:avLst/>
+                    </a:prstGeom>
+                  </pic:spPr>
+                </pic:pic>
+              </a:graphicData>
+            </a:graphic>
+          </wp:inline>
+        </w:drawing>
+      </w:r>
+    </w:p>
+    <w:p>
+      <w:pPr>
+        <w:pStyle w:val="Caption"/>
+        <w:jc w:val="center"/>
+      </w:pPr>
+      <w:bookmarkStart w:id="10" w:name="_Toc237657137"/>
+      <w:r>
+        <w:t xml:space="preserve">Figure </w:t>
+      </w:r>
+      <w:r>
+        <w:fldChar w:fldCharType="begin"/>
+      </w:r>
+      <w:r>
+        <w:instrText xml:space="preserve"> SEQ Figure \* ARABIC </w:instrText>
+      </w:r>
+      <w:r>
+        <w:fldChar w:fldCharType="separate"/>
+      </w:r>
+      <w:r>
+        <w:rPr>
+          <w:noProof/>
+        </w:rPr>
+        <w:t>10</w:t>
+      </w:r>
+      <w:r>
+        <w:fldChar w:fldCharType="end"/>
+      </w:r>
+      <w:r>
+        <w:t>: Cordova build successful</w:t>
+      </w:r>
+      <w:bookmarkEnd w:id="10"/>
+    </w:p>
+    <w:p/>
+    <w:p>
+      <w:pPr>
+        <w:keepNext/>
+        <w:jc w:val="center"/>
+      </w:pPr>
+      <w:r>
+        <w:drawing>
+          <wp:inline distT="0" distB="0" distL="0" distR="0" wp14:anchorId="5370FF03" wp14:editId="5D9B08B6">
+            <wp:extent cx="2001230" cy="4203700"/>
+            <wp:effectExtent l="0" t="0" r="0" b="6350"/>
+            <wp:docPr id="1275812478" name="Picture 1"/>
+            <wp:cNvGraphicFramePr>
+              <a:graphicFrameLocks xmlns:a="http://schemas.openxmlformats.org/drawingml/2006/main" noChangeAspect="1"/>
+            </wp:cNvGraphicFramePr>
+            <a:graphic xmlns:a="http://schemas.openxmlformats.org/drawingml/2006/main">
+              <a:graphicData uri="http://schemas.openxmlformats.org/drawingml/2006/picture">
+                <pic:pic xmlns:pic="http://schemas.openxmlformats.org/drawingml/2006/picture">
+                  <pic:nvPicPr>
+                    <pic:cNvPr id="1275812478" name=""/>
+                    <pic:cNvPicPr/>
+                  </pic:nvPicPr>
+                  <pic:blipFill>
+                    <a:blip r:embed="rId20"/>
+                    <a:stretch>
+                      <a:fillRect/>
+                    </a:stretch>
+                  </pic:blipFill>
+                  <pic:spPr>
+                    <a:xfrm>
+                      <a:off x="0" y="0"/>
+                      <a:ext cx="2003793" cy="4209085"/>
+                    </a:xfrm>
+                    <a:prstGeom prst="rect">
+                      <a:avLst/>
+                    </a:prstGeom>
+                  </pic:spPr>
+                </pic:pic>
+              </a:graphicData>
+            </a:graphic>
+          </wp:inline>
+        </w:drawing>
+      </w:r>
+    </w:p>
+    <w:p>
+      <w:pPr>
+        <w:pStyle w:val="Caption"/>
+        <w:jc w:val="center"/>
+      </w:pPr>
+      <w:bookmarkStart w:id="11" w:name="_Toc237657138"/>
+      <w:r>
+        <w:t xml:space="preserve">Figure </w:t>
+      </w:r>
+      <w:r>
+        <w:fldChar w:fldCharType="begin"/>
+      </w:r>
+      <w:r>
+        <w:instrText xml:space="preserve"> SEQ Figure \* ARABIC </w:instrText>
+      </w:r>
+      <w:r>
+        <w:fldChar w:fldCharType="separate"/>
+      </w:r>
+      <w:r>
+        <w:rPr>
+          <w:noProof/>
+        </w:rPr>
+        <w:t>11</w:t>
+      </w:r>
+      <w:r>
+        <w:fldChar w:fldCharType="end"/>
+      </w:r>
+      <w:r>
+        <w:t>: Application in Emulator</w:t>
+      </w:r>
+      <w:bookmarkEnd w:id="11"/>
+    </w:p>
+    <w:p>
+      <w:pPr>
+        <w:keepNext/>
+      </w:pPr>
+      <w:r>
+        <w:lastRenderedPageBreak/>
+        <w:drawing>
+          <wp:inline distT="0" distB="0" distL="0" distR="0" wp14:anchorId="1E0AC1A0" wp14:editId="2AEE5B78">
+            <wp:extent cx="5943600" cy="1734185"/>
+            <wp:effectExtent l="0" t="0" r="0" b="0"/>
+            <wp:docPr id="1638570761" name="Picture 1"/>
+            <wp:cNvGraphicFramePr>
+              <a:graphicFrameLocks xmlns:a="http://schemas.openxmlformats.org/drawingml/2006/main" noChangeAspect="1"/>
+            </wp:cNvGraphicFramePr>
+            <a:graphic xmlns:a="http://schemas.openxmlformats.org/drawingml/2006/main">
+              <a:graphicData uri="http://schemas.openxmlformats.org/drawingml/2006/picture">
+                <pic:pic xmlns:pic="http://schemas.openxmlformats.org/drawingml/2006/picture">
+                  <pic:nvPicPr>
+                    <pic:cNvPr id="1638570761" name=""/>
+                    <pic:cNvPicPr/>
+                  </pic:nvPicPr>
+                  <pic:blipFill>
+                    <a:blip r:embed="rId21"/>
+                    <a:stretch>
+                      <a:fillRect/>
+                    </a:stretch>
+                  </pic:blipFill>
+                  <pic:spPr>
+                    <a:xfrm>
+                      <a:off x="0" y="0"/>
+                      <a:ext cx="5943600" cy="1734185"/>
+                    </a:xfrm>
+                    <a:prstGeom prst="rect">
+                      <a:avLst/>
+                    </a:prstGeom>
+                  </pic:spPr>
+                </pic:pic>
+              </a:graphicData>
+            </a:graphic>
+          </wp:inline>
+        </w:drawing>
+      </w:r>
+    </w:p>
+    <w:p>
+      <w:pPr>
+        <w:pStyle w:val="Caption"/>
+        <w:jc w:val="center"/>
+      </w:pPr>
+      <w:bookmarkStart w:id="12" w:name="_Toc237657139"/>
+      <w:r>
+        <w:t xml:space="preserve">Figure </w:t>
+      </w:r>
+      <w:r>
+        <w:fldChar w:fldCharType="begin"/>
+      </w:r>
+      <w:r>
+        <w:instrText xml:space="preserve"> SEQ Figure \* ARABIC </w:instrText>
+      </w:r>
+      <w:r>
+        <w:fldChar w:fldCharType="separate"/>
+      </w:r>
+      <w:r>
+        <w:rPr>
+          <w:noProof/>
+        </w:rPr>
+        <w:t>12</w:t>
+      </w:r>
+      <w:r>
+        <w:fldChar w:fldCharType="end"/>
+      </w:r>
+      <w:r>
+        <w:t>: Starting the application electron</w:t>
+      </w:r>
+      <w:r>
+        <w:rPr>
+          <w:noProof/>
+        </w:rPr>
+        <w:t xml:space="preserve"> platform</w:t>
+      </w:r>
+      <w:bookmarkEnd w:id="12"/>
+    </w:p>
+    <w:p/>
+    <w:p/>
+    <w:p>
+      <w:pPr>
+        <w:keepNext/>
+      </w:pPr>
+      <w:r>
+        <w:drawing>
+          <wp:inline distT="0" distB="0" distL="0" distR="0" wp14:anchorId="4EF3AFCA" wp14:editId="4E872807">
+            <wp:extent cx="5943600" cy="4481195"/>
+            <wp:effectExtent l="0" t="0" r="0" b="0"/>
+            <wp:docPr id="1947752405" name="Picture 1"/>
+            <wp:cNvGraphicFramePr>
+              <a:graphicFrameLocks xmlns:a="http://schemas.openxmlformats.org/drawingml/2006/main" noChangeAspect="1"/>
+            </wp:cNvGraphicFramePr>
+            <a:graphic xmlns:a="http://schemas.openxmlformats.org/drawingml/2006/main">
+              <a:graphicData uri="http://schemas.openxmlformats.org/drawingml/2006/picture">
+                <pic:pic xmlns:pic="http://schemas.openxmlformats.org/drawingml/2006/picture">
+                  <pic:nvPicPr>
+                    <pic:cNvPr id="1947752405" name=""/>
+                    <pic:cNvPicPr/>
+                  </pic:nvPicPr>
+                  <pic:blipFill>
+                    <a:blip r:embed="rId22"/>
+                    <a:stretch>
+                      <a:fillRect/>
+                    </a:stretch>
+                  </pic:blipFill>
+                  <pic:spPr>
+                    <a:xfrm>
+                      <a:off x="0" y="0"/>
+                      <a:ext cx="5943600" cy="4481195"/>
+                    </a:xfrm>
+                    <a:prstGeom prst="rect">
+                      <a:avLst/>
+                    </a:prstGeom>
+                  </pic:spPr>
+                </pic:pic>
+              </a:graphicData>
+            </a:graphic>
+          </wp:inline>
+        </w:drawing>
+      </w:r>
+    </w:p>
+    <w:p>
+      <w:pPr>
+        <w:pStyle w:val="Caption"/>
+        <w:jc w:val="center"/>
+      </w:pPr>
+      <w:bookmarkStart w:id="13" w:name="_Toc237657140"/>
+      <w:r>
+        <w:t xml:space="preserve">Figure </w:t>
+      </w:r>
+      <w:r>
+        <w:fldChar w:fldCharType="begin"/>
+      </w:r>
+      <w:r>
+        <w:instrText xml:space="preserve"> SEQ Figure \* ARABIC </w:instrText>
+      </w:r>
+      <w:r>
+        <w:fldChar w:fldCharType="separate"/>
+      </w:r>
+      <w:r>
+        <w:rPr>
+          <w:noProof/>
+        </w:rPr>
+        <w:t>13</w:t>
+      </w:r>
+      <w:r>
+        <w:fldChar w:fldCharType="end"/>
+      </w:r>
+      <w:r>
+        <w:t>: Application in electron platform</w:t>
+      </w:r>
+      <w:bookmarkEnd w:id="13"/>
+    </w:p>
+    <w:p>
+      <w:r>
+        <w:br w:type="page"/>
+      </w:r>
+    </w:p>
+    <w:p>
+      <w:pPr>
+        <w:pStyle w:val="Heading2"/>
+      </w:pPr>
+      <w:bookmarkStart w:id="14" w:name="_Toc237657108"/>
+      <w:r>
+        <w:lastRenderedPageBreak/>
+        <w:t>Exploring Ionic</w:t>
+      </w:r>
+      <w:bookmarkEnd w:id="14"/>
+    </w:p>
+    <w:p>
+      <w:pPr>
+        <w:keepNext/>
+      </w:pPr>
+      <w:r>
+        <w:drawing>
+          <wp:inline distT="0" distB="0" distL="0" distR="0" wp14:anchorId="693F9769" wp14:editId="083312A1">
+            <wp:extent cx="5943600" cy="2230755"/>
+            <wp:effectExtent l="0" t="0" r="0" b="0"/>
+            <wp:docPr id="687185381" name="Picture 1"/>
+            <wp:cNvGraphicFramePr>
+              <a:graphicFrameLocks xmlns:a="http://schemas.openxmlformats.org/drawingml/2006/main" noChangeAspect="1"/>
+            </wp:cNvGraphicFramePr>
+            <a:graphic xmlns:a="http://schemas.openxmlformats.org/drawingml/2006/main">
+              <a:graphicData uri="http://schemas.openxmlformats.org/drawingml/2006/picture">
+                <pic:pic xmlns:pic="http://schemas.openxmlformats.org/drawingml/2006/picture">
+                  <pic:nvPicPr>
+                    <pic:cNvPr id="687185381" name=""/>
+                    <pic:cNvPicPr/>
+                  </pic:nvPicPr>
+                  <pic:blipFill>
+                    <a:blip r:embed="rId23"/>
+                    <a:stretch>
+                      <a:fillRect/>
+                    </a:stretch>
+                  </pic:blipFill>
+                  <pic:spPr>
+                    <a:xfrm>
+                      <a:off x="0" y="0"/>
+                      <a:ext cx="5943600" cy="2230755"/>
+                    </a:xfrm>
+                    <a:prstGeom prst="rect">
+                      <a:avLst/>
+                    </a:prstGeom>
+                  </pic:spPr>
+                </pic:pic>
+              </a:graphicData>
+            </a:graphic>
+          </wp:inline>
+        </w:drawing>
+      </w:r>
+    </w:p>
+    <w:p>
+      <w:pPr>
+        <w:pStyle w:val="Caption"/>
+        <w:jc w:val="center"/>
+      </w:pPr>
+      <w:bookmarkStart w:id="15" w:name="_Toc237657141"/>
+      <w:r>
+        <w:t xml:space="preserve">Figure </w:t>
+      </w:r>
+      <w:r>
+        <w:fldChar w:fldCharType="begin"/>
+      </w:r>
+      <w:r>
+        <w:instrText xml:space="preserve"> SEQ Figure \* ARABIC </w:instrText>
+      </w:r>
+      <w:r>
+        <w:fldChar w:fldCharType="separate"/>
+      </w:r>
+      <w:r>
+        <w:rPr>
+          <w:noProof/>
+        </w:rPr>
+        <w:t>14</w:t>
+      </w:r>
+      <w:r>
+        <w:fldChar w:fldCharType="end"/>
+      </w:r>
+      <w:r>
+        <w:t>: Installing Ionic</w:t>
+      </w:r>
+      <w:bookmarkEnd w:id="15"/>
+    </w:p>
+    <w:p/>
+    <w:p>
+      <w:pPr>
+        <w:keepNext/>
+        <w:jc w:val="center"/>
+      </w:pPr>
+      <w:r>
+        <w:drawing>
+          <wp:inline distT="0" distB="0" distL="0" distR="0" wp14:anchorId="2C7096A6" wp14:editId="76503BF6">
+            <wp:extent cx="1549480" cy="3340272"/>
+            <wp:effectExtent l="0" t="0" r="0" b="0"/>
+            <wp:docPr id="1632503625" name="Picture 1"/>
+            <wp:cNvGraphicFramePr>
+              <a:graphicFrameLocks xmlns:a="http://schemas.openxmlformats.org/drawingml/2006/main" noChangeAspect="1"/>
+            </wp:cNvGraphicFramePr>
+            <a:graphic xmlns:a="http://schemas.openxmlformats.org/drawingml/2006/main">
+              <a:graphicData uri="http://schemas.openxmlformats.org/drawingml/2006/picture">
+                <pic:pic xmlns:pic="http://schemas.openxmlformats.org/drawingml/2006/picture">
+                  <pic:nvPicPr>
+                    <pic:cNvPr id="1632503625" name=""/>
+                    <pic:cNvPicPr/>
+                  </pic:nvPicPr>
+                  <pic:blipFill>
+                    <a:blip r:embed="rId24"/>
+                    <a:stretch>
+                      <a:fillRect/>
+                    </a:stretch>
+                  </pic:blipFill>
+                  <pic:spPr>
+                    <a:xfrm>
+                      <a:off x="0" y="0"/>
+                      <a:ext cx="1549480" cy="3340272"/>
+                    </a:xfrm>
+                    <a:prstGeom prst="rect">
+                      <a:avLst/>
+                    </a:prstGeom>
+                  </pic:spPr>
+                </pic:pic>
+              </a:graphicData>
+            </a:graphic>
+          </wp:inline>
+        </w:drawing>
+      </w:r>
+    </w:p>
+    <w:p>
+      <w:pPr>
+        <w:pStyle w:val="Caption"/>
+        <w:jc w:val="center"/>
+      </w:pPr>
+      <w:bookmarkStart w:id="16" w:name="_Toc237657142"/>
+      <w:r>
+        <w:t xml:space="preserve">Figure </w:t>
+      </w:r>
+      <w:r>
+        <w:fldChar w:fldCharType="begin"/>
+      </w:r>
+      <w:r>
+        <w:instrText xml:space="preserve"> SEQ Figure \* ARABIC </w:instrText>
+      </w:r>
+      <w:r>
+        <w:fldChar w:fldCharType="separate"/>
+      </w:r>
+      <w:r>
+        <w:rPr>
+          <w:noProof/>
+        </w:rPr>
+        <w:t>15</w:t>
+      </w:r>
+      <w:r>
+        <w:fldChar w:fldCharType="end"/>
+      </w:r>
+      <w:r>
+        <w:t>: Photo Gallery Application -1</w:t>
+      </w:r>
+      <w:bookmarkEnd w:id="16"/>
+    </w:p>
+    <w:p/>
+    <w:p/>
+    <w:p>
+      <w:pPr>
+        <w:keepNext/>
+        <w:jc w:val="center"/>
+      </w:pPr>
+      <w:r>
+        <w:lastRenderedPageBreak/>
+        <w:drawing>
+          <wp:inline distT="0" distB="0" distL="0" distR="0" wp14:anchorId="577EF20D" wp14:editId="3C18BCDB">
+            <wp:extent cx="4997707" cy="4083260"/>
+            <wp:effectExtent l="0" t="0" r="0" b="0"/>
+            <wp:docPr id="1506987231" name="Picture 1"/>
+            <wp:cNvGraphicFramePr>
+              <a:graphicFrameLocks xmlns:a="http://schemas.openxmlformats.org/drawingml/2006/main" noChangeAspect="1"/>
+            </wp:cNvGraphicFramePr>
+            <a:graphic xmlns:a="http://schemas.openxmlformats.org/drawingml/2006/main">
+              <a:graphicData uri="http://schemas.openxmlformats.org/drawingml/2006/picture">
+                <pic:pic xmlns:pic="http://schemas.openxmlformats.org/drawingml/2006/picture">
+                  <pic:nvPicPr>
+                    <pic:cNvPr id="1506987231" name=""/>
+                    <pic:cNvPicPr/>
+                  </pic:nvPicPr>
+                  <pic:blipFill>
+                    <a:blip r:embed="rId25"/>
+                    <a:stretch>
+                      <a:fillRect/>
+                    </a:stretch>
+                  </pic:blipFill>
+                  <pic:spPr>
+                    <a:xfrm>
+                      <a:off x="0" y="0"/>
+                      <a:ext cx="4997707" cy="4083260"/>
+                    </a:xfrm>
+                    <a:prstGeom prst="rect">
+                      <a:avLst/>
+                    </a:prstGeom>
+                  </pic:spPr>
+                </pic:pic>
+              </a:graphicData>
+            </a:graphic>
+          </wp:inline>
+        </w:drawing>
+      </w:r>
+    </w:p>
+    <w:p>
+      <w:pPr>
+        <w:pStyle w:val="Caption"/>
+        <w:jc w:val="center"/>
+      </w:pPr>
+      <w:bookmarkStart w:id="17" w:name="_Toc237657143"/>
+      <w:r>
+        <w:t xml:space="preserve">Figure </w:t>
+      </w:r>
+      <w:r>
+        <w:fldChar w:fldCharType="begin"/>
+      </w:r>
+      <w:r>
+        <w:instrText xml:space="preserve"> SEQ Figure \* ARABIC </w:instrText>
+      </w:r>
+      <w:r>
+        <w:fldChar w:fldCharType="separate"/>
+      </w:r>
+      <w:r>
+        <w:rPr>
+          <w:noProof/>
+        </w:rPr>
+        <w:t>16</w:t>
+      </w:r>
+      <w:r>
+        <w:fldChar w:fldCharType="end"/>
+      </w:r>
+      <w:r>
+        <w:t>: Photo Gallery Application -2</w:t>
+      </w:r>
+      <w:bookmarkEnd w:id="17"/>
     </w:p>
     <w:sectPr>
       <w:pgSz w:w="12240" w:h="15840"/>
       <w:pgMar w:top="1440" w:right="1440" w:bottom="1440" w:left="1440" w:header="720" w:footer="720" w:gutter="0"/>
+      <w:pgNumType w:start="0"/>
       <w:cols w:space="720"/>
+      <w:titlePg/>
       <w:docGrid w:linePitch="360"/>
     </w:sectPr>
   </w:body>
@@ -1046,7 +3853,6 @@
     <w:next w:val="Normal"/>
     <w:link w:val="Heading2Char"/>
     <w:uiPriority w:val="9"/>
-    <w:semiHidden/>
     <w:unhideWhenUsed/>
     <w:qFormat/>
     <w:rsid w:val="00E11929"/>
@@ -1221,7 +4027,6 @@
   <w:style w:type="character" w:default="1" w:styleId="DefaultParagraphFont">
     <w:name w:val="Default Paragraph Font"/>
     <w:uiPriority w:val="1"/>
-    <w:semiHidden/>
     <w:unhideWhenUsed/>
   </w:style>
   <w:style w:type="table" w:default="1" w:styleId="TableNormal">
@@ -1263,7 +4068,6 @@
     <w:basedOn w:val="DefaultParagraphFont"/>
     <w:link w:val="Heading2"/>
     <w:uiPriority w:val="9"/>
-    <w:semiHidden/>
     <w:rsid w:val="00E11929"/>
     <w:rPr>
       <w:rFonts w:asciiTheme="majorHAnsi" w:eastAsiaTheme="majorEastAsia" w:hAnsiTheme="majorHAnsi" w:cstheme="majorBidi"/>
@@ -1553,6 +4357,104 @@
       <w:sz w:val="18"/>
       <w:szCs w:val="18"/>
     </w:rPr>
+  </w:style>
+  <w:style w:type="paragraph" w:styleId="NoSpacing">
+    <w:name w:val="No Spacing"/>
+    <w:link w:val="NoSpacingChar"/>
+    <w:uiPriority w:val="1"/>
+    <w:qFormat/>
+    <w:rsid w:val="00706F95"/>
+    <w:pPr>
+      <w:spacing w:after="0" w:line="240" w:lineRule="auto"/>
+    </w:pPr>
+    <w:rPr>
+      <w:kern w:val="0"/>
+      <w:sz w:val="22"/>
+      <w:szCs w:val="22"/>
+      <w:lang w:eastAsia="en-US"/>
+      <w14:ligatures w14:val="none"/>
+    </w:rPr>
+  </w:style>
+  <w:style w:type="character" w:customStyle="1" w:styleId="NoSpacingChar">
+    <w:name w:val="No Spacing Char"/>
+    <w:basedOn w:val="DefaultParagraphFont"/>
+    <w:link w:val="NoSpacing"/>
+    <w:uiPriority w:val="1"/>
+    <w:rsid w:val="00706F95"/>
+    <w:rPr>
+      <w:kern w:val="0"/>
+      <w:sz w:val="22"/>
+      <w:szCs w:val="22"/>
+      <w:lang w:eastAsia="en-US"/>
+      <w14:ligatures w14:val="none"/>
+    </w:rPr>
+  </w:style>
+  <w:style w:type="character" w:styleId="Hyperlink">
+    <w:name w:val="Hyperlink"/>
+    <w:basedOn w:val="DefaultParagraphFont"/>
+    <w:uiPriority w:val="99"/>
+    <w:unhideWhenUsed/>
+    <w:rsid w:val="00706F95"/>
+    <w:rPr>
+      <w:color w:val="467886" w:themeColor="hyperlink"/>
+      <w:u w:val="single"/>
+    </w:rPr>
+  </w:style>
+  <w:style w:type="character" w:styleId="UnresolvedMention">
+    <w:name w:val="Unresolved Mention"/>
+    <w:basedOn w:val="DefaultParagraphFont"/>
+    <w:uiPriority w:val="99"/>
+    <w:semiHidden/>
+    <w:unhideWhenUsed/>
+    <w:rsid w:val="00706F95"/>
+    <w:rPr>
+      <w:color w:val="605E5C"/>
+      <w:shd w:val="clear" w:color="auto" w:fill="E1DFDD"/>
+    </w:rPr>
+  </w:style>
+  <w:style w:type="paragraph" w:styleId="TOCHeading">
+    <w:name w:val="TOC Heading"/>
+    <w:basedOn w:val="Heading1"/>
+    <w:next w:val="Normal"/>
+    <w:uiPriority w:val="39"/>
+    <w:unhideWhenUsed/>
+    <w:qFormat/>
+    <w:rsid w:val="00706F95"/>
+    <w:pPr>
+      <w:spacing w:before="240" w:after="0" w:line="259" w:lineRule="auto"/>
+      <w:outlineLvl w:val="9"/>
+    </w:pPr>
+    <w:rPr>
+      <w:kern w:val="0"/>
+      <w:sz w:val="32"/>
+      <w:szCs w:val="32"/>
+      <w:lang w:eastAsia="en-US"/>
+      <w14:ligatures w14:val="none"/>
+    </w:rPr>
+  </w:style>
+  <w:style w:type="paragraph" w:styleId="TOC2">
+    <w:name w:val="toc 2"/>
+    <w:basedOn w:val="Normal"/>
+    <w:next w:val="Normal"/>
+    <w:autoRedefine/>
+    <w:uiPriority w:val="39"/>
+    <w:unhideWhenUsed/>
+    <w:rsid w:val="00706F95"/>
+    <w:pPr>
+      <w:spacing w:after="100"/>
+      <w:ind w:left="240"/>
+    </w:pPr>
+  </w:style>
+  <w:style w:type="paragraph" w:styleId="TableofFigures">
+    <w:name w:val="table of figures"/>
+    <w:basedOn w:val="Normal"/>
+    <w:next w:val="Normal"/>
+    <w:uiPriority w:val="99"/>
+    <w:unhideWhenUsed/>
+    <w:rsid w:val="00706F95"/>
+    <w:pPr>
+      <w:spacing w:after="0"/>
+    </w:pPr>
   </w:style>
 </w:styles>
 </file>
@@ -1870,4 +4772,35 @@
     </a:ext>
   </a:extLst>
 </a:theme>
+</file>
+
+<file path=customXml/item1.xml><?xml version="1.0" encoding="utf-8"?>
+<CoverPageProperties xmlns="http://schemas.microsoft.com/office/2006/coverPageProps">
+  <PublishDate/>
+  <Abstract>Exploring Hybrid Mobile Technologies</Abstract>
+  <CompanyAddress/>
+  <CompanyPhone/>
+  <CompanyFax/>
+  <CompanyEmail>ms26933474@my.sliit.lk</CompanyEmail>
+</CoverPageProperties>
+</file>
+
+<file path=customXml/item2.xml><?xml version="1.0" encoding="utf-8"?>
+<b:Sources xmlns:b="http://schemas.openxmlformats.org/officeDocument/2006/bibliography" xmlns="http://schemas.openxmlformats.org/officeDocument/2006/bibliography" SelectedStyle="\APASixthEditionOfficeOnline.xsl" StyleName="APA" Version="6"/>
+</file>
+
+<file path=customXml/itemProps1.xml><?xml version="1.0" encoding="utf-8"?>
+<ds:datastoreItem xmlns:ds="http://schemas.openxmlformats.org/officeDocument/2006/customXml" ds:itemID="{55AF091B-3C7A-41E3-B477-F2FDAA23CFDA}">
+  <ds:schemaRefs>
+    <ds:schemaRef ds:uri="http://schemas.microsoft.com/office/2006/coverPageProps"/>
+  </ds:schemaRefs>
+</ds:datastoreItem>
+</file>
+
+<file path=customXml/itemProps2.xml><?xml version="1.0" encoding="utf-8"?>
+<ds:datastoreItem xmlns:ds="http://schemas.openxmlformats.org/officeDocument/2006/customXml" ds:itemID="{BE78062A-A24D-4AAB-B797-0F1A2DFA3048}">
+  <ds:schemaRefs>
+    <ds:schemaRef ds:uri="http://schemas.openxmlformats.org/officeDocument/2006/bibliography"/>
+  </ds:schemaRefs>
+</ds:datastoreItem>
 </file>
</xml_diff>